<commit_message>
R 3,4 + początek 5
</commit_message>
<xml_diff>
--- a/_PRACA MAGISTERSKA/praca_magisterska_sgh_v3.docx
+++ b/_PRACA MAGISTERSKA/praca_magisterska_sgh_v3.docx
@@ -4100,45 +4100,25 @@
       <w:r>
         <w:t xml:space="preserve">Rysunek </w:t>
       </w:r>
-      <w:r>
-        <w:fldChar w:fldCharType="begin"/>
-      </w:r>
-      <w:r>
-        <w:instrText xml:space="preserve"> STYLEREF 1 \s </w:instrText>
-      </w:r>
-      <w:r>
-        <w:fldChar w:fldCharType="separate"/>
-      </w:r>
-      <w:r>
-        <w:rPr>
-          <w:noProof/>
-        </w:rPr>
-        <w:t>2</w:t>
-      </w:r>
-      <w:r>
-        <w:fldChar w:fldCharType="end"/>
-      </w:r>
+      <w:fldSimple w:instr=" STYLEREF 1 \s ">
+        <w:r>
+          <w:rPr>
+            <w:noProof/>
+          </w:rPr>
+          <w:t>2</w:t>
+        </w:r>
+      </w:fldSimple>
       <w:r>
         <w:noBreakHyphen/>
       </w:r>
-      <w:r>
-        <w:fldChar w:fldCharType="begin"/>
-      </w:r>
-      <w:r>
-        <w:instrText xml:space="preserve"> SEQ Rysunek \* ARABIC \s 1 </w:instrText>
-      </w:r>
-      <w:r>
-        <w:fldChar w:fldCharType="separate"/>
-      </w:r>
-      <w:r>
-        <w:rPr>
-          <w:noProof/>
-        </w:rPr>
-        <w:t>1</w:t>
-      </w:r>
-      <w:r>
-        <w:fldChar w:fldCharType="end"/>
-      </w:r>
+      <w:fldSimple w:instr=" SEQ Rysunek \* ARABIC \s 1 ">
+        <w:r>
+          <w:rPr>
+            <w:noProof/>
+          </w:rPr>
+          <w:t>1</w:t>
+        </w:r>
+      </w:fldSimple>
       <w:r>
         <w:t xml:space="preserve"> </w:t>
       </w:r>
@@ -4450,15 +4430,7 @@
           <w:sz w:val="24"/>
           <w:szCs w:val="24"/>
         </w:rPr>
-        <w:t>będąca standardem w ewaluacji algorytmów detekcji arytmii</w:t>
-      </w:r>
-      <w:r>
-        <w:rPr>
-          <w:rFonts w:ascii="Times New Roman" w:hAnsi="Times New Roman" w:cs="Times New Roman"/>
-          <w:sz w:val="24"/>
-          <w:szCs w:val="24"/>
-        </w:rPr>
-        <w:t xml:space="preserve"> </w:t>
+        <w:t xml:space="preserve">będąca standardem w ewaluacji algorytmów detekcji arytmii </w:t>
       </w:r>
       <w:r>
         <w:rPr>
@@ -5811,51 +5783,25 @@
       <w:r>
         <w:t xml:space="preserve">Tabela </w:t>
       </w:r>
-      <w:r>
-        <w:fldChar w:fldCharType="begin"/>
-      </w:r>
-      <w:r>
-        <w:instrText xml:space="preserve"> STYLEREF 1 \s </w:instrText>
-      </w:r>
-      <w:r>
-        <w:fldChar w:fldCharType="separate"/>
-      </w:r>
-      <w:r>
-        <w:rPr>
-          <w:noProof/>
-        </w:rPr>
-        <w:t>3</w:t>
-      </w:r>
-      <w:r>
-        <w:rPr>
-          <w:noProof/>
-        </w:rPr>
-        <w:fldChar w:fldCharType="end"/>
-      </w:r>
+      <w:fldSimple w:instr=" STYLEREF 1 \s ">
+        <w:r>
+          <w:rPr>
+            <w:noProof/>
+          </w:rPr>
+          <w:t>3</w:t>
+        </w:r>
+      </w:fldSimple>
       <w:r>
         <w:noBreakHyphen/>
       </w:r>
-      <w:r>
-        <w:fldChar w:fldCharType="begin"/>
-      </w:r>
-      <w:r>
-        <w:instrText xml:space="preserve"> SEQ Tabela \* ARABIC \s 1 </w:instrText>
-      </w:r>
-      <w:r>
-        <w:fldChar w:fldCharType="separate"/>
-      </w:r>
-      <w:r>
-        <w:rPr>
-          <w:noProof/>
-        </w:rPr>
-        <w:t>1</w:t>
-      </w:r>
-      <w:r>
-        <w:rPr>
-          <w:noProof/>
-        </w:rPr>
-        <w:fldChar w:fldCharType="end"/>
-      </w:r>
+      <w:fldSimple w:instr=" SEQ Tabela \* ARABIC \s 1 ">
+        <w:r>
+          <w:rPr>
+            <w:noProof/>
+          </w:rPr>
+          <w:t>1</w:t>
+        </w:r>
+      </w:fldSimple>
       <w:r>
         <w:t xml:space="preserve"> Mapowanie klas pobudzeni zgodnie ze standardem AAMI EC57.</w:t>
       </w:r>
@@ -5943,7 +5889,7 @@
         </w:rPr>
         <w:lastRenderedPageBreak/>
         <w:drawing>
-          <wp:inline distT="0" distB="0" distL="0" distR="0" wp14:anchorId="56229CD0" wp14:editId="2C6F6B62">
+          <wp:inline distT="0" distB="0" distL="0" distR="0" wp14:anchorId="56229CD0" wp14:editId="118E9420">
             <wp:extent cx="5759450" cy="3422650"/>
             <wp:effectExtent l="0" t="0" r="0" b="6350"/>
             <wp:docPr id="386852549" name="Obraz 10"/>
@@ -6000,45 +5946,25 @@
       <w:r>
         <w:t xml:space="preserve">Rysunek </w:t>
       </w:r>
-      <w:r>
-        <w:fldChar w:fldCharType="begin"/>
-      </w:r>
-      <w:r>
-        <w:instrText xml:space="preserve"> STYLEREF 1 \s </w:instrText>
-      </w:r>
-      <w:r>
-        <w:fldChar w:fldCharType="separate"/>
-      </w:r>
-      <w:r>
-        <w:rPr>
-          <w:noProof/>
-        </w:rPr>
-        <w:t>3</w:t>
-      </w:r>
-      <w:r>
-        <w:fldChar w:fldCharType="end"/>
-      </w:r>
+      <w:fldSimple w:instr=" STYLEREF 1 \s ">
+        <w:r>
+          <w:rPr>
+            <w:noProof/>
+          </w:rPr>
+          <w:t>3</w:t>
+        </w:r>
+      </w:fldSimple>
       <w:r>
         <w:noBreakHyphen/>
       </w:r>
-      <w:r>
-        <w:fldChar w:fldCharType="begin"/>
-      </w:r>
-      <w:r>
-        <w:instrText xml:space="preserve"> SEQ Rysunek \* ARABIC \s 1 </w:instrText>
-      </w:r>
-      <w:r>
-        <w:fldChar w:fldCharType="separate"/>
-      </w:r>
-      <w:r>
-        <w:rPr>
-          <w:noProof/>
-        </w:rPr>
-        <w:t>1</w:t>
-      </w:r>
-      <w:r>
-        <w:fldChar w:fldCharType="end"/>
-      </w:r>
+      <w:fldSimple w:instr=" SEQ Rysunek \* ARABIC \s 1 ">
+        <w:r>
+          <w:rPr>
+            <w:noProof/>
+          </w:rPr>
+          <w:t>1</w:t>
+        </w:r>
+      </w:fldSimple>
       <w:r>
         <w:t xml:space="preserve"> </w:t>
       </w:r>
@@ -7110,51 +7036,25 @@
       <w:r>
         <w:t xml:space="preserve">Tabela </w:t>
       </w:r>
-      <w:r>
-        <w:fldChar w:fldCharType="begin"/>
-      </w:r>
-      <w:r>
-        <w:instrText xml:space="preserve"> STYLEREF 1 \s </w:instrText>
-      </w:r>
-      <w:r>
-        <w:fldChar w:fldCharType="separate"/>
-      </w:r>
-      <w:r>
-        <w:rPr>
-          <w:noProof/>
-        </w:rPr>
-        <w:t>3</w:t>
-      </w:r>
-      <w:r>
-        <w:rPr>
-          <w:noProof/>
-        </w:rPr>
-        <w:fldChar w:fldCharType="end"/>
-      </w:r>
+      <w:fldSimple w:instr=" STYLEREF 1 \s ">
+        <w:r>
+          <w:rPr>
+            <w:noProof/>
+          </w:rPr>
+          <w:t>3</w:t>
+        </w:r>
+      </w:fldSimple>
       <w:r>
         <w:noBreakHyphen/>
       </w:r>
-      <w:r>
-        <w:fldChar w:fldCharType="begin"/>
-      </w:r>
-      <w:r>
-        <w:instrText xml:space="preserve"> SEQ Tabela \* ARABIC \s 1 </w:instrText>
-      </w:r>
-      <w:r>
-        <w:fldChar w:fldCharType="separate"/>
-      </w:r>
-      <w:r>
-        <w:rPr>
-          <w:noProof/>
-        </w:rPr>
-        <w:t>2</w:t>
-      </w:r>
-      <w:r>
-        <w:rPr>
-          <w:noProof/>
-        </w:rPr>
-        <w:fldChar w:fldCharType="end"/>
-      </w:r>
+      <w:fldSimple w:instr=" SEQ Tabela \* ARABIC \s 1 ">
+        <w:r>
+          <w:rPr>
+            <w:noProof/>
+          </w:rPr>
+          <w:t>2</w:t>
+        </w:r>
+      </w:fldSimple>
       <w:r>
         <w:t xml:space="preserve"> Proporcje pobudzeni w klasach</w:t>
       </w:r>
@@ -8064,51 +7964,25 @@
       <w:r>
         <w:t xml:space="preserve">Tabela </w:t>
       </w:r>
-      <w:r>
-        <w:fldChar w:fldCharType="begin"/>
-      </w:r>
-      <w:r>
-        <w:instrText xml:space="preserve"> STYLEREF 1 \s </w:instrText>
-      </w:r>
-      <w:r>
-        <w:fldChar w:fldCharType="separate"/>
-      </w:r>
-      <w:r>
-        <w:rPr>
-          <w:noProof/>
-        </w:rPr>
-        <w:t>3</w:t>
-      </w:r>
-      <w:r>
-        <w:rPr>
-          <w:noProof/>
-        </w:rPr>
-        <w:fldChar w:fldCharType="end"/>
-      </w:r>
+      <w:fldSimple w:instr=" STYLEREF 1 \s ">
+        <w:r>
+          <w:rPr>
+            <w:noProof/>
+          </w:rPr>
+          <w:t>3</w:t>
+        </w:r>
+      </w:fldSimple>
       <w:r>
         <w:noBreakHyphen/>
       </w:r>
-      <w:r>
-        <w:fldChar w:fldCharType="begin"/>
-      </w:r>
-      <w:r>
-        <w:instrText xml:space="preserve"> SEQ Tabela \* ARABIC \s 1 </w:instrText>
-      </w:r>
-      <w:r>
-        <w:fldChar w:fldCharType="separate"/>
-      </w:r>
-      <w:r>
-        <w:rPr>
-          <w:noProof/>
-        </w:rPr>
-        <w:t>3</w:t>
-      </w:r>
-      <w:r>
-        <w:rPr>
-          <w:noProof/>
-        </w:rPr>
-        <w:fldChar w:fldCharType="end"/>
-      </w:r>
+      <w:fldSimple w:instr=" SEQ Tabela \* ARABIC \s 1 ">
+        <w:r>
+          <w:rPr>
+            <w:noProof/>
+          </w:rPr>
+          <w:t>3</w:t>
+        </w:r>
+      </w:fldSimple>
       <w:r>
         <w:t xml:space="preserve"> Statystyki amplitudy sygnału w zbiorze danych</w:t>
       </w:r>
@@ -8225,7 +8099,7 @@
           <w:szCs w:val="24"/>
         </w:rPr>
         <w:drawing>
-          <wp:inline distT="0" distB="0" distL="0" distR="0" wp14:anchorId="5842C490" wp14:editId="6880B367">
+          <wp:inline distT="0" distB="0" distL="0" distR="0" wp14:anchorId="5842C490" wp14:editId="0CC58BBD">
             <wp:extent cx="5753100" cy="2203450"/>
             <wp:effectExtent l="0" t="0" r="0" b="6350"/>
             <wp:docPr id="703982334" name="Obraz 11"/>
@@ -8282,45 +8156,25 @@
       <w:r>
         <w:t xml:space="preserve">Rysunek </w:t>
       </w:r>
-      <w:r>
-        <w:fldChar w:fldCharType="begin"/>
-      </w:r>
-      <w:r>
-        <w:instrText xml:space="preserve"> STYLEREF 1 \s </w:instrText>
-      </w:r>
-      <w:r>
-        <w:fldChar w:fldCharType="separate"/>
-      </w:r>
-      <w:r>
-        <w:rPr>
-          <w:noProof/>
-        </w:rPr>
-        <w:t>3</w:t>
-      </w:r>
-      <w:r>
-        <w:fldChar w:fldCharType="end"/>
-      </w:r>
+      <w:fldSimple w:instr=" STYLEREF 1 \s ">
+        <w:r>
+          <w:rPr>
+            <w:noProof/>
+          </w:rPr>
+          <w:t>3</w:t>
+        </w:r>
+      </w:fldSimple>
       <w:r>
         <w:noBreakHyphen/>
       </w:r>
-      <w:r>
-        <w:fldChar w:fldCharType="begin"/>
-      </w:r>
-      <w:r>
-        <w:instrText xml:space="preserve"> SEQ Rysunek \* ARABIC \s 1 </w:instrText>
-      </w:r>
-      <w:r>
-        <w:fldChar w:fldCharType="separate"/>
-      </w:r>
-      <w:r>
-        <w:rPr>
-          <w:noProof/>
-        </w:rPr>
-        <w:t>2</w:t>
-      </w:r>
-      <w:r>
-        <w:fldChar w:fldCharType="end"/>
-      </w:r>
+      <w:fldSimple w:instr=" SEQ Rysunek \* ARABIC \s 1 ">
+        <w:r>
+          <w:rPr>
+            <w:noProof/>
+          </w:rPr>
+          <w:t>2</w:t>
+        </w:r>
+      </w:fldSimple>
       <w:r>
         <w:t xml:space="preserve"> Rozkład amplitud sygnału EKG</w:t>
       </w:r>
@@ -8371,7 +8225,7 @@
           <w:noProof/>
         </w:rPr>
         <w:drawing>
-          <wp:inline distT="0" distB="0" distL="0" distR="0" wp14:anchorId="549AAE15" wp14:editId="5343A39C">
+          <wp:inline distT="0" distB="0" distL="0" distR="0" wp14:anchorId="549AAE15" wp14:editId="5239C19D">
             <wp:extent cx="4233902" cy="3504885"/>
             <wp:effectExtent l="0" t="0" r="0" b="635"/>
             <wp:docPr id="318960103" name="Obraz 3"/>
@@ -8429,45 +8283,25 @@
       <w:r>
         <w:t xml:space="preserve">Rysunek </w:t>
       </w:r>
-      <w:r>
-        <w:fldChar w:fldCharType="begin"/>
-      </w:r>
-      <w:r>
-        <w:instrText xml:space="preserve"> STYLEREF 1 \s </w:instrText>
-      </w:r>
-      <w:r>
-        <w:fldChar w:fldCharType="separate"/>
-      </w:r>
-      <w:r>
-        <w:rPr>
-          <w:noProof/>
-        </w:rPr>
-        <w:t>3</w:t>
-      </w:r>
-      <w:r>
-        <w:fldChar w:fldCharType="end"/>
-      </w:r>
+      <w:fldSimple w:instr=" STYLEREF 1 \s ">
+        <w:r>
+          <w:rPr>
+            <w:noProof/>
+          </w:rPr>
+          <w:t>3</w:t>
+        </w:r>
+      </w:fldSimple>
       <w:r>
         <w:noBreakHyphen/>
       </w:r>
-      <w:r>
-        <w:fldChar w:fldCharType="begin"/>
-      </w:r>
-      <w:r>
-        <w:instrText xml:space="preserve"> SEQ Rysunek \* ARABIC \s 1 </w:instrText>
-      </w:r>
-      <w:r>
-        <w:fldChar w:fldCharType="separate"/>
-      </w:r>
-      <w:r>
-        <w:rPr>
-          <w:noProof/>
-        </w:rPr>
-        <w:t>3</w:t>
-      </w:r>
-      <w:r>
-        <w:fldChar w:fldCharType="end"/>
-      </w:r>
+      <w:fldSimple w:instr=" SEQ Rysunek \* ARABIC \s 1 ">
+        <w:r>
+          <w:rPr>
+            <w:noProof/>
+          </w:rPr>
+          <w:t>3</w:t>
+        </w:r>
+      </w:fldSimple>
       <w:r>
         <w:t xml:space="preserve"> Przykładowe przebiegi QRS dla klas.</w:t>
       </w:r>
@@ -8541,45 +8375,25 @@
       <w:r>
         <w:t xml:space="preserve">Rysunek </w:t>
       </w:r>
-      <w:r>
-        <w:fldChar w:fldCharType="begin"/>
-      </w:r>
-      <w:r>
-        <w:instrText xml:space="preserve"> STYLEREF 1 \s </w:instrText>
-      </w:r>
-      <w:r>
-        <w:fldChar w:fldCharType="separate"/>
-      </w:r>
-      <w:r>
-        <w:rPr>
-          <w:noProof/>
-        </w:rPr>
-        <w:t>3</w:t>
-      </w:r>
-      <w:r>
-        <w:fldChar w:fldCharType="end"/>
-      </w:r>
+      <w:fldSimple w:instr=" STYLEREF 1 \s ">
+        <w:r>
+          <w:rPr>
+            <w:noProof/>
+          </w:rPr>
+          <w:t>3</w:t>
+        </w:r>
+      </w:fldSimple>
       <w:r>
         <w:noBreakHyphen/>
       </w:r>
-      <w:r>
-        <w:fldChar w:fldCharType="begin"/>
-      </w:r>
-      <w:r>
-        <w:instrText xml:space="preserve"> SEQ Rysunek \* ARABIC \s 1 </w:instrText>
-      </w:r>
-      <w:r>
-        <w:fldChar w:fldCharType="separate"/>
-      </w:r>
-      <w:r>
-        <w:rPr>
-          <w:noProof/>
-        </w:rPr>
-        <w:t>4</w:t>
-      </w:r>
-      <w:r>
-        <w:fldChar w:fldCharType="end"/>
-      </w:r>
+      <w:fldSimple w:instr=" SEQ Rysunek \* ARABIC \s 1 ">
+        <w:r>
+          <w:rPr>
+            <w:noProof/>
+          </w:rPr>
+          <w:t>4</w:t>
+        </w:r>
+      </w:fldSimple>
       <w:r>
         <w:t xml:space="preserve"> Uśredniony przebieg QRS</w:t>
       </w:r>
@@ -9196,15 +9010,7 @@
           <w:sz w:val="24"/>
           <w:szCs w:val="24"/>
         </w:rPr>
-        <w:t xml:space="preserve"> </w:t>
-      </w:r>
-      <w:r>
-        <w:rPr>
-          <w:rFonts w:ascii="Times New Roman" w:hAnsi="Times New Roman" w:cs="Times New Roman"/>
-          <w:sz w:val="24"/>
-          <w:szCs w:val="24"/>
-        </w:rPr>
-        <w:t xml:space="preserve"> </w:t>
+        <w:t xml:space="preserve">  </w:t>
       </w:r>
       <w:r>
         <w:rPr>
@@ -9909,23 +9715,7 @@
           <w:sz w:val="24"/>
           <w:szCs w:val="24"/>
         </w:rPr>
-        <w:t>afka-python</w:t>
-      </w:r>
-      <w:r>
-        <w:rPr>
-          <w:rFonts w:ascii="Times New Roman" w:hAnsi="Times New Roman" w:cs="Times New Roman"/>
-          <w:sz w:val="24"/>
-          <w:szCs w:val="24"/>
-        </w:rPr>
-        <w:t xml:space="preserve">: Biblioteka odpowiedzialna za </w:t>
-      </w:r>
-      <w:r>
-        <w:rPr>
-          <w:rFonts w:ascii="Times New Roman" w:hAnsi="Times New Roman" w:cs="Times New Roman"/>
-          <w:sz w:val="24"/>
-          <w:szCs w:val="24"/>
-        </w:rPr>
-        <w:t>interfejs producenta i konsumenta Kafki</w:t>
+        <w:t>afka-python: Biblioteka odpowiedzialna za interfejs producenta i konsumenta Kafki</w:t>
       </w:r>
       <w:r>
         <w:rPr>
@@ -10317,45 +10107,25 @@
       <w:r>
         <w:t xml:space="preserve">Rysunek </w:t>
       </w:r>
-      <w:r>
-        <w:fldChar w:fldCharType="begin"/>
-      </w:r>
-      <w:r>
-        <w:instrText xml:space="preserve"> STYLEREF 1 \s </w:instrText>
-      </w:r>
-      <w:r>
-        <w:fldChar w:fldCharType="separate"/>
-      </w:r>
-      <w:r>
-        <w:rPr>
-          <w:noProof/>
-        </w:rPr>
-        <w:t>4</w:t>
-      </w:r>
-      <w:r>
-        <w:fldChar w:fldCharType="end"/>
-      </w:r>
+      <w:fldSimple w:instr=" STYLEREF 1 \s ">
+        <w:r>
+          <w:rPr>
+            <w:noProof/>
+          </w:rPr>
+          <w:t>4</w:t>
+        </w:r>
+      </w:fldSimple>
       <w:r>
         <w:noBreakHyphen/>
       </w:r>
-      <w:r>
-        <w:fldChar w:fldCharType="begin"/>
-      </w:r>
-      <w:r>
-        <w:instrText xml:space="preserve"> SEQ Rysunek \* ARABIC \s 1 </w:instrText>
-      </w:r>
-      <w:r>
-        <w:fldChar w:fldCharType="separate"/>
-      </w:r>
-      <w:r>
-        <w:rPr>
-          <w:noProof/>
-        </w:rPr>
-        <w:t>1</w:t>
-      </w:r>
-      <w:r>
-        <w:fldChar w:fldCharType="end"/>
-      </w:r>
+      <w:fldSimple w:instr=" SEQ Rysunek \* ARABIC \s 1 ">
+        <w:r>
+          <w:rPr>
+            <w:noProof/>
+          </w:rPr>
+          <w:t>1</w:t>
+        </w:r>
+      </w:fldSimple>
       <w:r>
         <w:t xml:space="preserve"> Schemat potoku przetwarzania.</w:t>
       </w:r>
@@ -10647,15 +10417,7 @@
           <w:sz w:val="24"/>
           <w:szCs w:val="24"/>
         </w:rPr>
-        <w:t xml:space="preserve">) i uruchamia </w:t>
-      </w:r>
-      <w:r>
-        <w:rPr>
-          <w:rFonts w:ascii="Times New Roman" w:hAnsi="Times New Roman" w:cs="Times New Roman"/>
-          <w:sz w:val="24"/>
-          <w:szCs w:val="24"/>
-        </w:rPr>
-        <w:t xml:space="preserve">algorytm </w:t>
+        <w:t xml:space="preserve">) i uruchamia algorytm </w:t>
       </w:r>
       <w:r>
         <w:rPr>
@@ -10687,15 +10449,7 @@
           <w:sz w:val="24"/>
           <w:szCs w:val="24"/>
         </w:rPr>
-        <w:t>algorytmu opisano w rozdziale 4.3)</w:t>
-      </w:r>
-      <w:r>
-        <w:rPr>
-          <w:rFonts w:ascii="Times New Roman" w:hAnsi="Times New Roman" w:cs="Times New Roman"/>
-          <w:sz w:val="24"/>
-          <w:szCs w:val="24"/>
-        </w:rPr>
-        <w:t xml:space="preserve"> w celu detekcji</w:t>
+        <w:t>algorytmu opisano w rozdziale 4.3) w celu detekcji</w:t>
       </w:r>
       <w:r>
         <w:rPr>
@@ -11387,6 +11141,7 @@
       <w:r>
         <w:rPr>
           <w:rFonts w:ascii="Times New Roman" w:hAnsi="Times New Roman" w:cs="Times New Roman"/>
+          <w:noProof/>
           <w:sz w:val="24"/>
           <w:szCs w:val="24"/>
         </w:rPr>
@@ -11453,45 +11208,25 @@
       <w:r>
         <w:t xml:space="preserve">Rysunek </w:t>
       </w:r>
-      <w:r>
-        <w:fldChar w:fldCharType="begin"/>
-      </w:r>
-      <w:r>
-        <w:instrText xml:space="preserve"> STYLEREF 1 \s </w:instrText>
-      </w:r>
-      <w:r>
-        <w:fldChar w:fldCharType="separate"/>
-      </w:r>
-      <w:r>
-        <w:rPr>
-          <w:noProof/>
-        </w:rPr>
-        <w:t>4</w:t>
-      </w:r>
-      <w:r>
-        <w:fldChar w:fldCharType="end"/>
-      </w:r>
+      <w:fldSimple w:instr=" STYLEREF 1 \s ">
+        <w:r>
+          <w:rPr>
+            <w:noProof/>
+          </w:rPr>
+          <w:t>4</w:t>
+        </w:r>
+      </w:fldSimple>
       <w:r>
         <w:noBreakHyphen/>
       </w:r>
-      <w:r>
-        <w:fldChar w:fldCharType="begin"/>
-      </w:r>
-      <w:r>
-        <w:instrText xml:space="preserve"> SEQ Rysunek \* ARABIC \s 1 </w:instrText>
-      </w:r>
-      <w:r>
-        <w:fldChar w:fldCharType="separate"/>
-      </w:r>
-      <w:r>
-        <w:rPr>
-          <w:noProof/>
-        </w:rPr>
-        <w:t>2</w:t>
-      </w:r>
-      <w:r>
-        <w:fldChar w:fldCharType="end"/>
-      </w:r>
+      <w:fldSimple w:instr=" SEQ Rysunek \* ARABIC \s 1 ">
+        <w:r>
+          <w:rPr>
+            <w:noProof/>
+          </w:rPr>
+          <w:t>2</w:t>
+        </w:r>
+      </w:fldSimple>
       <w:r>
         <w:t xml:space="preserve"> Etapy algorytmu Pan-Tomkins na przykładzie rekordu 101.</w:t>
       </w:r>
@@ -12243,19 +11978,1829 @@
       </w:pPr>
       <w:bookmarkStart w:id="32" w:name="_Toc229263554"/>
       <w:r>
+        <w:t>Wizualizacja danych</w:t>
+      </w:r>
+      <w:r>
+        <w:t xml:space="preserve"> w czasie rzeczywistym</w:t>
+      </w:r>
+      <w:bookmarkEnd w:id="32"/>
+    </w:p>
+    <w:p>
+      <w:pPr>
+        <w:pStyle w:val="NormalnyWeb"/>
+        <w:spacing w:line="360" w:lineRule="auto"/>
+        <w:jc w:val="both"/>
+        <w:rPr>
+          <w:rFonts w:ascii="Cambria Math" w:hAnsi="Cambria Math"/>
+        </w:rPr>
+      </w:pPr>
+      <w:r>
+        <w:rPr>
+          <w:rFonts w:ascii="Cambria Math" w:hAnsi="Cambria Math"/>
+        </w:rPr>
+        <w:t>Wizualizacja w czasie rzeczywistym stanowi finalny etap potoku przetwarzania danych.</w:t>
+      </w:r>
+      <w:r>
+        <w:rPr>
+          <w:rFonts w:ascii="Cambria Math" w:hAnsi="Cambria Math"/>
+        </w:rPr>
+        <w:t xml:space="preserve"> </w:t>
+      </w:r>
+      <w:r>
+        <w:rPr>
+          <w:rFonts w:ascii="Cambria Math" w:hAnsi="Cambria Math"/>
+        </w:rPr>
+        <w:t xml:space="preserve">Kluczowym wyzwaniem w projektowaniu interfejsu czasu rzeczywistego było zapewnienie spójności między napływającym strumieniem danych a wynikami klasyfikacji modelu głębokiego uczenia. </w:t>
+      </w:r>
+    </w:p>
+    <w:p>
+      <w:pPr>
+        <w:pStyle w:val="NormalnyWeb"/>
+        <w:spacing w:line="360" w:lineRule="auto"/>
+        <w:jc w:val="both"/>
+        <w:rPr>
+          <w:rFonts w:ascii="Cambria Math" w:hAnsi="Cambria Math"/>
+        </w:rPr>
+      </w:pPr>
+      <w:r>
+        <w:rPr>
+          <w:rFonts w:ascii="Cambria Math" w:hAnsi="Cambria Math"/>
+        </w:rPr>
         <w:lastRenderedPageBreak/>
-        <w:t>Wizualizacja danych</w:t>
-      </w:r>
-      <w:r>
-        <w:t xml:space="preserve"> w czasie rzeczywistym</w:t>
-      </w:r>
-      <w:bookmarkEnd w:id="32"/>
+        <w:t>Kluczową strukturą danych jest kolejka collections.deque z ograniczonym rozmiarem (maxlen). Zastosowanie deque zamiast listy eliminuje konieczność ręcznego usuwania najstarszych próbek</w:t>
+      </w:r>
+      <w:r>
+        <w:rPr>
+          <w:rFonts w:ascii="Cambria Math" w:hAnsi="Cambria Math"/>
+        </w:rPr>
+        <w:t>. P</w:t>
+      </w:r>
+      <w:r>
+        <w:rPr>
+          <w:rFonts w:ascii="Cambria Math" w:hAnsi="Cambria Math"/>
+        </w:rPr>
+        <w:t>o wypełnieniu bufora nowe próbki automatycznie wypychają najstarsze z przeciwnego końca, co zapewnia O(1) dla operacji append</w:t>
+      </w:r>
+      <w:r>
+        <w:rPr>
+          <w:rFonts w:ascii="Cambria Math" w:hAnsi="Cambria Math"/>
+        </w:rPr>
+        <w:t>.</w:t>
+      </w:r>
+    </w:p>
+    <w:p>
+      <w:pPr>
+        <w:pStyle w:val="NormalnyWeb"/>
+        <w:spacing w:line="360" w:lineRule="auto"/>
+        <w:jc w:val="both"/>
+        <w:rPr>
+          <w:rFonts w:ascii="Cambria Math" w:hAnsi="Cambria Math"/>
+        </w:rPr>
+      </w:pPr>
+      <w:r>
+        <w:rPr>
+          <w:rFonts w:ascii="Cambria Math" w:hAnsi="Cambria Math"/>
+        </w:rPr>
+        <w:t xml:space="preserve">Zastosowano mechanizm podwójnego buforowania: </w:t>
+      </w:r>
+      <w:r>
+        <w:rPr>
+          <w:rStyle w:val="HTML-kod"/>
+          <w:rFonts w:ascii="Cambria Math" w:hAnsi="Cambria Math"/>
+          <w:sz w:val="24"/>
+          <w:szCs w:val="24"/>
+        </w:rPr>
+        <w:t>plot_buffer</w:t>
+      </w:r>
+      <w:r>
+        <w:rPr>
+          <w:rStyle w:val="HTML-kod"/>
+          <w:rFonts w:ascii="Cambria Math" w:hAnsi="Cambria Math"/>
+          <w:sz w:val="24"/>
+          <w:szCs w:val="24"/>
+        </w:rPr>
+        <w:t>,</w:t>
+      </w:r>
+      <w:r>
+        <w:rPr>
+          <w:rFonts w:ascii="Cambria Math" w:hAnsi="Cambria Math"/>
+        </w:rPr>
+        <w:t xml:space="preserve"> </w:t>
+      </w:r>
+      <w:r>
+        <w:rPr>
+          <w:rFonts w:ascii="Cambria Math" w:hAnsi="Cambria Math"/>
+        </w:rPr>
+        <w:t xml:space="preserve">który </w:t>
+      </w:r>
+      <w:r>
+        <w:rPr>
+          <w:rFonts w:ascii="Cambria Math" w:hAnsi="Cambria Math"/>
+        </w:rPr>
+        <w:t xml:space="preserve">odpowiada za płynność wyświetlania </w:t>
+      </w:r>
+      <w:r>
+        <w:rPr>
+          <w:rFonts w:ascii="Cambria Math" w:hAnsi="Cambria Math"/>
+        </w:rPr>
+        <w:t>sygnału</w:t>
+      </w:r>
+      <w:r>
+        <w:rPr>
+          <w:rFonts w:ascii="Cambria Math" w:hAnsi="Cambria Math"/>
+        </w:rPr>
+        <w:t xml:space="preserve"> EKG, podczas gdy większy bufor </w:t>
+      </w:r>
+      <w:r>
+        <w:rPr>
+          <w:rStyle w:val="HTML-kod"/>
+          <w:rFonts w:ascii="Cambria Math" w:hAnsi="Cambria Math"/>
+          <w:sz w:val="24"/>
+          <w:szCs w:val="24"/>
+        </w:rPr>
+        <w:t>pt_buf</w:t>
+      </w:r>
+      <w:r>
+        <w:rPr>
+          <w:rFonts w:ascii="Cambria Math" w:hAnsi="Cambria Math"/>
+        </w:rPr>
+        <w:t xml:space="preserve"> dostarcza kontekst niezbędny dla algorytmu Pan-Tompkinsa oraz modelu </w:t>
+      </w:r>
+      <w:r>
+        <w:rPr>
+          <w:rFonts w:ascii="Cambria Math" w:hAnsi="Cambria Math"/>
+        </w:rPr>
+        <w:t>ML.</w:t>
+      </w:r>
+      <w:r>
+        <w:rPr>
+          <w:rFonts w:ascii="Cambria Math" w:hAnsi="Cambria Math"/>
+        </w:rPr>
+        <w:t xml:space="preserve"> </w:t>
+      </w:r>
+      <w:r>
+        <w:rPr>
+          <w:rFonts w:ascii="Cambria Math" w:hAnsi="Cambria Math"/>
+        </w:rPr>
+        <w:t>Rozdzielenie bufora wizualizacji (krótki, 1000 próbek ≈ 2,78 s) od bufora detekcji (długi, 2880 próbek ≈ 8 s) jest uzasadnione różnymi wymaganiami obu procesów</w:t>
+      </w:r>
+      <w:r>
+        <w:rPr>
+          <w:rFonts w:ascii="Cambria Math" w:hAnsi="Cambria Math"/>
+        </w:rPr>
+        <w:t>,</w:t>
+      </w:r>
+      <w:r>
+        <w:rPr>
+          <w:rFonts w:ascii="Cambria Math" w:hAnsi="Cambria Math"/>
+        </w:rPr>
+        <w:t xml:space="preserve"> wykres musi być czytelny dla użytkownika i nie może zawierać zbyt wielu</w:t>
+      </w:r>
+      <w:r>
+        <w:rPr>
+          <w:rFonts w:ascii="Cambria Math" w:hAnsi="Cambria Math"/>
+        </w:rPr>
+        <w:t xml:space="preserve"> </w:t>
+      </w:r>
+      <w:r>
+        <w:rPr>
+          <w:rFonts w:ascii="Cambria Math" w:hAnsi="Cambria Math"/>
+        </w:rPr>
+        <w:t>punktów, natomiast algorytm Pan-Tompkinsa wymaga dłuższego okna sygnału do poprawnej detekcji i filtracji.</w:t>
+      </w:r>
+    </w:p>
+    <w:p>
+      <w:pPr>
+        <w:pStyle w:val="NormalnyWeb"/>
+        <w:spacing w:line="360" w:lineRule="auto"/>
+        <w:jc w:val="both"/>
+        <w:rPr>
+          <w:rFonts w:ascii="Cambria Math" w:hAnsi="Cambria Math"/>
+        </w:rPr>
+      </w:pPr>
+      <w:r>
+        <w:rPr>
+          <w:rFonts w:ascii="Cambria Math" w:hAnsi="Cambria Math"/>
+        </w:rPr>
+        <w:t xml:space="preserve">Standardowe użycie biblioteki Matplotlib jest blokujące </w:t>
+      </w:r>
+      <w:r>
+        <w:rPr>
+          <w:rFonts w:ascii="Cambria Math" w:hAnsi="Cambria Math"/>
+        </w:rPr>
+        <w:t>dla przetwarzania w czasie rzeczywistym.</w:t>
+      </w:r>
+      <w:r>
+        <w:rPr>
+          <w:rFonts w:ascii="Cambria Math" w:hAnsi="Cambria Math"/>
+        </w:rPr>
+        <w:t xml:space="preserve"> </w:t>
+      </w:r>
+      <w:r>
+        <w:rPr>
+          <w:rFonts w:ascii="Cambria Math" w:hAnsi="Cambria Math"/>
+        </w:rPr>
+        <w:t>W</w:t>
+      </w:r>
+      <w:r>
+        <w:rPr>
+          <w:rFonts w:ascii="Cambria Math" w:hAnsi="Cambria Math"/>
+        </w:rPr>
+        <w:t xml:space="preserve">ywołanie </w:t>
+      </w:r>
+      <w:r>
+        <w:rPr>
+          <w:rFonts w:ascii="Cambria Math" w:hAnsi="Cambria Math"/>
+        </w:rPr>
+        <w:t xml:space="preserve">funkcji </w:t>
+      </w:r>
+      <w:r>
+        <w:rPr>
+          <w:rFonts w:ascii="Cambria Math" w:hAnsi="Cambria Math"/>
+        </w:rPr>
+        <w:t>plt.show() zatrzymuje wykonanie programu do</w:t>
+      </w:r>
+      <w:r>
+        <w:rPr>
+          <w:rFonts w:ascii="Cambria Math" w:hAnsi="Cambria Math"/>
+        </w:rPr>
+        <w:t xml:space="preserve"> </w:t>
+      </w:r>
+      <w:r>
+        <w:rPr>
+          <w:rFonts w:ascii="Cambria Math" w:hAnsi="Cambria Math"/>
+        </w:rPr>
+        <w:t>momentu zamknięcia okna. Aby umożliwić ciągłe odświeżanie wykresu w pętli głównej, zastosowano tryb interaktywny:</w:t>
+      </w:r>
+      <w:r>
+        <w:rPr>
+          <w:rFonts w:ascii="Cambria Math" w:hAnsi="Cambria Math"/>
+        </w:rPr>
+        <w:t xml:space="preserve"> </w:t>
+      </w:r>
+      <w:r>
+        <w:rPr>
+          <w:rFonts w:ascii="Cambria Math" w:hAnsi="Cambria Math"/>
+        </w:rPr>
+        <w:t>plt.ion()</w:t>
+      </w:r>
+      <w:r>
+        <w:rPr>
+          <w:rFonts w:ascii="Cambria Math" w:hAnsi="Cambria Math"/>
+        </w:rPr>
+        <w:t>. N</w:t>
+      </w:r>
+      <w:r>
+        <w:rPr>
+          <w:rFonts w:ascii="Cambria Math" w:hAnsi="Cambria Math"/>
+        </w:rPr>
+        <w:t xml:space="preserve">atomiast w celu uniknięcia </w:t>
+      </w:r>
+      <w:r>
+        <w:rPr>
+          <w:rFonts w:ascii="Cambria Math" w:hAnsi="Cambria Math"/>
+        </w:rPr>
+        <w:t>migotania obrazu</w:t>
+      </w:r>
+      <w:r>
+        <w:rPr>
+          <w:rFonts w:ascii="Cambria Math" w:hAnsi="Cambria Math"/>
+        </w:rPr>
+        <w:t xml:space="preserve"> </w:t>
+      </w:r>
+      <w:r>
+        <w:rPr>
+          <w:rFonts w:ascii="Cambria Math" w:hAnsi="Cambria Math"/>
+        </w:rPr>
+        <w:t xml:space="preserve">i nadmiernego obciążenia procesora, częstotliwość odświeżania grafiki została zoptymalizowana (parametr </w:t>
+      </w:r>
+      <w:r>
+        <w:rPr>
+          <w:rStyle w:val="HTML-kod"/>
+          <w:rFonts w:ascii="Cambria Math" w:hAnsi="Cambria Math"/>
+        </w:rPr>
+        <w:t>plt.pause(0.001)</w:t>
+      </w:r>
+      <w:r>
+        <w:rPr>
+          <w:rFonts w:ascii="Cambria Math" w:hAnsi="Cambria Math"/>
+        </w:rPr>
+        <w:t>). System automatycznie zarządza cyklem życia obiektów graficznych (</w:t>
+      </w:r>
+      <w:r>
+        <w:rPr>
+          <w:rStyle w:val="HTML-kod"/>
+          <w:rFonts w:ascii="Cambria Math" w:hAnsi="Cambria Math"/>
+        </w:rPr>
+        <w:t>current_artists</w:t>
+      </w:r>
+      <w:r>
+        <w:rPr>
+          <w:rFonts w:ascii="Cambria Math" w:hAnsi="Cambria Math"/>
+        </w:rPr>
+        <w:t>), usuwając adnotacje, które opuściły bieżące okno czasowe, co zapobiega wyciekom pamięci podczas długotrwałego monitoringu</w:t>
+      </w:r>
+      <w:r>
+        <w:rPr>
+          <w:rFonts w:ascii="Cambria Math" w:hAnsi="Cambria Math"/>
+        </w:rPr>
+        <w:t xml:space="preserve">. </w:t>
+      </w:r>
+      <w:r>
+        <w:rPr>
+          <w:rFonts w:ascii="Cambria Math" w:hAnsi="Cambria Math"/>
+        </w:rPr>
+        <w:t>Wywołanie plt.pause() jest niezbędne</w:t>
+      </w:r>
+      <w:r>
+        <w:rPr>
+          <w:rFonts w:ascii="Cambria Math" w:hAnsi="Cambria Math"/>
+        </w:rPr>
+        <w:t xml:space="preserve">, ponieważ </w:t>
+      </w:r>
+      <w:r>
+        <w:rPr>
+          <w:rFonts w:ascii="Cambria Math" w:hAnsi="Cambria Math"/>
+        </w:rPr>
+        <w:t xml:space="preserve"> bez niego okno graficzne nie przetwarza zdarzeń systemowych i pozostaje</w:t>
+      </w:r>
+      <w:r>
+        <w:rPr>
+          <w:rFonts w:ascii="Cambria Math" w:hAnsi="Cambria Math"/>
+        </w:rPr>
+        <w:t xml:space="preserve"> </w:t>
+      </w:r>
+      <w:r>
+        <w:rPr>
+          <w:rFonts w:ascii="Cambria Math" w:hAnsi="Cambria Math"/>
+        </w:rPr>
+        <w:t>zamrożone. Wartość 1 ms jest minimalna i w praktyce nie wprowadza odczuwalnego opóźnienia, a jednocześnie zapewnia</w:t>
+      </w:r>
+      <w:r>
+        <w:rPr>
+          <w:rFonts w:ascii="Cambria Math" w:hAnsi="Cambria Math"/>
+        </w:rPr>
+        <w:t xml:space="preserve"> </w:t>
+      </w:r>
+      <w:r>
+        <w:rPr>
+          <w:rFonts w:ascii="Cambria Math" w:hAnsi="Cambria Math"/>
+        </w:rPr>
+        <w:t>responsywność interfejsu.</w:t>
+      </w:r>
+    </w:p>
+    <w:p>
+      <w:pPr>
+        <w:pStyle w:val="NormalnyWeb"/>
+        <w:spacing w:line="360" w:lineRule="auto"/>
+        <w:jc w:val="both"/>
+        <w:rPr>
+          <w:rFonts w:ascii="Cambria Math" w:hAnsi="Cambria Math"/>
+        </w:rPr>
+      </w:pPr>
+      <w:r>
+        <w:rPr>
+          <w:rFonts w:ascii="Cambria Math" w:hAnsi="Cambria Math"/>
+        </w:rPr>
+        <w:t>Inicjalizacja wykresu tworzy obiekt Line2D za pomocą wzorca pusty plot:</w:t>
+      </w:r>
+    </w:p>
+    <w:p>
+      <w:pPr>
+        <w:pStyle w:val="NormalnyWeb"/>
+        <w:spacing w:line="360" w:lineRule="auto"/>
+        <w:jc w:val="both"/>
+        <w:rPr>
+          <w:rFonts w:ascii="Consolas" w:hAnsi="Consolas"/>
+          <w:lang w:val="en-US"/>
+        </w:rPr>
+      </w:pPr>
+      <w:r>
+        <w:rPr>
+          <w:rFonts w:ascii="Cambria Math" w:hAnsi="Cambria Math"/>
+          <w:lang w:val="en-US"/>
+        </w:rPr>
+        <w:t xml:space="preserve">  </w:t>
+      </w:r>
+      <w:r>
+        <w:rPr>
+          <w:rFonts w:ascii="Consolas" w:hAnsi="Consolas"/>
+          <w:sz w:val="18"/>
+          <w:szCs w:val="18"/>
+          <w:lang w:val="en-US"/>
+        </w:rPr>
+        <w:t>line, = ax.plot([], [], 'b-', lw=1, label='EKG (Lead I)')</w:t>
+      </w:r>
+    </w:p>
+    <w:p>
+      <w:pPr>
+        <w:pStyle w:val="NormalnyWeb"/>
+        <w:spacing w:line="360" w:lineRule="auto"/>
+        <w:jc w:val="both"/>
+        <w:rPr>
+          <w:rFonts w:ascii="Cambria Math" w:hAnsi="Cambria Math"/>
+        </w:rPr>
+      </w:pPr>
+      <w:r>
+        <w:rPr>
+          <w:rFonts w:ascii="Cambria Math" w:hAnsi="Cambria Math"/>
+        </w:rPr>
+        <w:t>Zwrócony obiekt line jest przechowywany przez cały czas działania programu. Aktualizacja przebiega nie przez tworzenie</w:t>
+      </w:r>
+      <w:r>
+        <w:rPr>
+          <w:rFonts w:ascii="Cambria Math" w:hAnsi="Cambria Math"/>
+        </w:rPr>
+        <w:t xml:space="preserve"> </w:t>
+      </w:r>
+      <w:r>
+        <w:rPr>
+          <w:rFonts w:ascii="Cambria Math" w:hAnsi="Cambria Math"/>
+        </w:rPr>
+        <w:t>nowych obiektów, lecz przez podmianę danych w istniejącym:</w:t>
+      </w:r>
+    </w:p>
+    <w:p>
+      <w:pPr>
+        <w:pStyle w:val="NormalnyWeb"/>
+        <w:spacing w:after="0" w:afterAutospacing="0" w:line="360" w:lineRule="auto"/>
+        <w:jc w:val="both"/>
+        <w:rPr>
+          <w:rFonts w:ascii="Consolas" w:hAnsi="Consolas"/>
+          <w:sz w:val="18"/>
+          <w:szCs w:val="18"/>
+          <w:lang w:val="en-US"/>
+        </w:rPr>
+      </w:pPr>
+      <w:r>
+        <w:rPr>
+          <w:rFonts w:ascii="Cambria Math" w:hAnsi="Cambria Math"/>
+          <w:lang w:val="en-US"/>
+        </w:rPr>
+        <w:t xml:space="preserve">  </w:t>
+      </w:r>
+      <w:r>
+        <w:rPr>
+          <w:rFonts w:ascii="Consolas" w:hAnsi="Consolas"/>
+          <w:sz w:val="18"/>
+          <w:szCs w:val="18"/>
+          <w:lang w:val="en-US"/>
+        </w:rPr>
+        <w:t>line.set_xdata(np.arange(len(</w:t>
+      </w:r>
+      <w:r>
+        <w:rPr>
+          <w:rFonts w:ascii="Consolas" w:hAnsi="Consolas"/>
+          <w:sz w:val="18"/>
+          <w:szCs w:val="18"/>
+          <w:lang w:val="en-US"/>
+        </w:rPr>
+        <w:t>plot buffer</w:t>
+      </w:r>
+      <w:r>
+        <w:rPr>
+          <w:rFonts w:ascii="Consolas" w:hAnsi="Consolas"/>
+          <w:sz w:val="18"/>
+          <w:szCs w:val="18"/>
+          <w:lang w:val="en-US"/>
+        </w:rPr>
+        <w:t>)))</w:t>
+      </w:r>
+    </w:p>
+    <w:p>
+      <w:pPr>
+        <w:pStyle w:val="NormalnyWeb"/>
+        <w:spacing w:before="0" w:beforeAutospacing="0" w:line="360" w:lineRule="auto"/>
+        <w:jc w:val="both"/>
+        <w:rPr>
+          <w:rFonts w:ascii="Consolas" w:hAnsi="Consolas"/>
+          <w:sz w:val="18"/>
+          <w:szCs w:val="18"/>
+          <w:lang w:val="en-US"/>
+        </w:rPr>
+      </w:pPr>
+      <w:r>
+        <w:rPr>
+          <w:rFonts w:ascii="Consolas" w:hAnsi="Consolas"/>
+          <w:sz w:val="18"/>
+          <w:szCs w:val="18"/>
+          <w:lang w:val="en-US"/>
+        </w:rPr>
+        <w:t xml:space="preserve"> line.set_ydata(list(plot_buffer))</w:t>
+      </w:r>
+    </w:p>
+    <w:p>
+      <w:pPr>
+        <w:pStyle w:val="NormalnyWeb"/>
+        <w:spacing w:line="360" w:lineRule="auto"/>
+        <w:jc w:val="both"/>
+        <w:rPr>
+          <w:rFonts w:ascii="Cambria Math" w:hAnsi="Cambria Math"/>
+        </w:rPr>
+      </w:pPr>
+      <w:r>
+        <w:rPr>
+          <w:rFonts w:ascii="Cambria Math" w:hAnsi="Cambria Math"/>
+        </w:rPr>
+        <w:lastRenderedPageBreak/>
+        <w:t>Takie podejście jest znacząco wydajniejsze niż ponowne rysowanie (ax.clear() + ax.plot()), ponieważ nie powoduje reinicjalizacji wszystkich elementów osi.</w:t>
+      </w:r>
+    </w:p>
+    <w:p>
+      <w:pPr>
+        <w:pStyle w:val="NormalnyWeb"/>
+        <w:spacing w:line="360" w:lineRule="auto"/>
+        <w:jc w:val="both"/>
+        <w:rPr>
+          <w:rFonts w:ascii="Cambria Math" w:hAnsi="Cambria Math"/>
+        </w:rPr>
+      </w:pPr>
+      <w:r>
+        <w:rPr>
+          <w:rFonts w:ascii="Cambria Math" w:hAnsi="Cambria Math"/>
+        </w:rPr>
+        <w:t>Strategia częstości odświeżania</w:t>
+      </w:r>
+    </w:p>
+    <w:p>
+      <w:pPr>
+        <w:pStyle w:val="NormalnyWeb"/>
+        <w:spacing w:line="360" w:lineRule="auto"/>
+        <w:jc w:val="both"/>
+        <w:rPr>
+          <w:rFonts w:ascii="Cambria Math" w:hAnsi="Cambria Math"/>
+        </w:rPr>
+      </w:pPr>
+      <w:r>
+        <w:rPr>
+          <w:rFonts w:ascii="Cambria Math" w:hAnsi="Cambria Math"/>
+        </w:rPr>
+        <w:t>Sygnał EKG napływa z prędkością 360 próbek/s. Odświeżanie wykresu przy każdej próbce byłoby zbędne i obciążałoby CPU.  W implementacji zastosowano dwa niezależne harmonogramy</w:t>
+      </w:r>
+      <w:r>
+        <w:rPr>
+          <w:rFonts w:ascii="Cambria Math" w:hAnsi="Cambria Math"/>
+        </w:rPr>
+        <w:t xml:space="preserve"> (Tabela 4-1)</w:t>
+      </w:r>
+      <w:r>
+        <w:rPr>
+          <w:rFonts w:ascii="Cambria Math" w:hAnsi="Cambria Math"/>
+        </w:rPr>
+        <w:t>:</w:t>
+      </w:r>
     </w:p>
     <w:p>
       <w:pPr>
         <w:pStyle w:val="Legenda"/>
-      </w:pPr>
-      <w:r>
+        <w:keepNext/>
+      </w:pPr>
+      <w:r>
+        <w:t xml:space="preserve">Tabela </w:t>
+      </w:r>
+      <w:fldSimple w:instr=" STYLEREF 1 \s ">
+        <w:r>
+          <w:rPr>
+            <w:noProof/>
+          </w:rPr>
+          <w:t>4</w:t>
+        </w:r>
+      </w:fldSimple>
+      <w:r>
+        <w:noBreakHyphen/>
+      </w:r>
+      <w:fldSimple w:instr=" SEQ Tabela \* ARABIC \s 1 ">
+        <w:r>
+          <w:rPr>
+            <w:noProof/>
+          </w:rPr>
+          <w:t>1</w:t>
+        </w:r>
+      </w:fldSimple>
+    </w:p>
+    <w:tbl>
+      <w:tblPr>
+        <w:tblStyle w:val="Tabelalisty7kolorowa"/>
+        <w:tblW w:w="0" w:type="auto"/>
+        <w:tblLook w:val="06A0" w:firstRow="1" w:lastRow="0" w:firstColumn="1" w:lastColumn="0" w:noHBand="1" w:noVBand="1"/>
+      </w:tblPr>
+      <w:tblGrid>
+        <w:gridCol w:w="2410"/>
+        <w:gridCol w:w="1701"/>
+        <w:gridCol w:w="1701"/>
+        <w:gridCol w:w="3250"/>
+      </w:tblGrid>
+      <w:tr>
+        <w:trPr>
+          <w:cnfStyle w:val="100000000000" w:firstRow="1" w:lastRow="0" w:firstColumn="0" w:lastColumn="0" w:oddVBand="0" w:evenVBand="0" w:oddHBand="0" w:evenHBand="0" w:firstRowFirstColumn="0" w:firstRowLastColumn="0" w:lastRowFirstColumn="0" w:lastRowLastColumn="0"/>
+        </w:trPr>
+        <w:tc>
+          <w:tcPr>
+            <w:cnfStyle w:val="001000000100" w:firstRow="0" w:lastRow="0" w:firstColumn="1" w:lastColumn="0" w:oddVBand="0" w:evenVBand="0" w:oddHBand="0" w:evenHBand="0" w:firstRowFirstColumn="1" w:firstRowLastColumn="0" w:lastRowFirstColumn="0" w:lastRowLastColumn="0"/>
+            <w:tcW w:w="2410" w:type="dxa"/>
+          </w:tcPr>
+          <w:p>
+            <w:pPr>
+              <w:pStyle w:val="NormalnyWeb"/>
+              <w:spacing w:line="360" w:lineRule="auto"/>
+              <w:jc w:val="both"/>
+              <w:rPr>
+                <w:b/>
+                <w:bCs/>
+                <w:i w:val="0"/>
+                <w:iCs w:val="0"/>
+                <w:sz w:val="22"/>
+                <w:szCs w:val="22"/>
+              </w:rPr>
+            </w:pPr>
+            <w:r>
+              <w:rPr>
+                <w:b/>
+                <w:bCs/>
+                <w:i w:val="0"/>
+                <w:iCs w:val="0"/>
+                <w:sz w:val="22"/>
+                <w:szCs w:val="22"/>
+              </w:rPr>
+              <w:t xml:space="preserve">Zdarzenie          </w:t>
+            </w:r>
+          </w:p>
+        </w:tc>
+        <w:tc>
+          <w:tcPr>
+            <w:tcW w:w="1701" w:type="dxa"/>
+          </w:tcPr>
+          <w:p>
+            <w:pPr>
+              <w:pStyle w:val="NormalnyWeb"/>
+              <w:spacing w:line="360" w:lineRule="auto"/>
+              <w:jc w:val="both"/>
+              <w:cnfStyle w:val="100000000000" w:firstRow="1" w:lastRow="0" w:firstColumn="0" w:lastColumn="0" w:oddVBand="0" w:evenVBand="0" w:oddHBand="0" w:evenHBand="0" w:firstRowFirstColumn="0" w:firstRowLastColumn="0" w:lastRowFirstColumn="0" w:lastRowLastColumn="0"/>
+              <w:rPr>
+                <w:b/>
+                <w:bCs/>
+                <w:i w:val="0"/>
+                <w:iCs w:val="0"/>
+                <w:sz w:val="22"/>
+                <w:szCs w:val="22"/>
+              </w:rPr>
+            </w:pPr>
+            <w:r>
+              <w:rPr>
+                <w:b/>
+                <w:bCs/>
+                <w:i w:val="0"/>
+                <w:iCs w:val="0"/>
+                <w:sz w:val="22"/>
+                <w:szCs w:val="22"/>
+              </w:rPr>
+              <w:t>Co ile próbek</w:t>
+            </w:r>
+          </w:p>
+        </w:tc>
+        <w:tc>
+          <w:tcPr>
+            <w:tcW w:w="1701" w:type="dxa"/>
+          </w:tcPr>
+          <w:p>
+            <w:pPr>
+              <w:pStyle w:val="NormalnyWeb"/>
+              <w:spacing w:line="360" w:lineRule="auto"/>
+              <w:jc w:val="both"/>
+              <w:cnfStyle w:val="100000000000" w:firstRow="1" w:lastRow="0" w:firstColumn="0" w:lastColumn="0" w:oddVBand="0" w:evenVBand="0" w:oddHBand="0" w:evenHBand="0" w:firstRowFirstColumn="0" w:firstRowLastColumn="0" w:lastRowFirstColumn="0" w:lastRowLastColumn="0"/>
+              <w:rPr>
+                <w:b/>
+                <w:bCs/>
+                <w:i w:val="0"/>
+                <w:iCs w:val="0"/>
+                <w:sz w:val="22"/>
+                <w:szCs w:val="22"/>
+              </w:rPr>
+            </w:pPr>
+            <w:r>
+              <w:rPr>
+                <w:b/>
+                <w:bCs/>
+                <w:i w:val="0"/>
+                <w:iCs w:val="0"/>
+                <w:sz w:val="22"/>
+                <w:szCs w:val="22"/>
+              </w:rPr>
+              <w:t>Częstotliwość</w:t>
+            </w:r>
+          </w:p>
+        </w:tc>
+        <w:tc>
+          <w:tcPr>
+            <w:tcW w:w="3250" w:type="dxa"/>
+          </w:tcPr>
+          <w:p>
+            <w:pPr>
+              <w:pStyle w:val="NormalnyWeb"/>
+              <w:spacing w:line="360" w:lineRule="auto"/>
+              <w:jc w:val="both"/>
+              <w:cnfStyle w:val="100000000000" w:firstRow="1" w:lastRow="0" w:firstColumn="0" w:lastColumn="0" w:oddVBand="0" w:evenVBand="0" w:oddHBand="0" w:evenHBand="0" w:firstRowFirstColumn="0" w:firstRowLastColumn="0" w:lastRowFirstColumn="0" w:lastRowLastColumn="0"/>
+              <w:rPr>
+                <w:b/>
+                <w:bCs/>
+                <w:i w:val="0"/>
+                <w:iCs w:val="0"/>
+                <w:sz w:val="22"/>
+                <w:szCs w:val="22"/>
+              </w:rPr>
+            </w:pPr>
+            <w:r>
+              <w:rPr>
+                <w:b/>
+                <w:bCs/>
+                <w:i w:val="0"/>
+                <w:iCs w:val="0"/>
+                <w:sz w:val="22"/>
+                <w:szCs w:val="22"/>
+              </w:rPr>
+              <w:t>Cel</w:t>
+            </w:r>
+          </w:p>
+        </w:tc>
+      </w:tr>
+      <w:tr>
+        <w:tc>
+          <w:tcPr>
+            <w:cnfStyle w:val="001000000000" w:firstRow="0" w:lastRow="0" w:firstColumn="1" w:lastColumn="0" w:oddVBand="0" w:evenVBand="0" w:oddHBand="0" w:evenHBand="0" w:firstRowFirstColumn="0" w:firstRowLastColumn="0" w:lastRowFirstColumn="0" w:lastRowLastColumn="0"/>
+            <w:tcW w:w="2410" w:type="dxa"/>
+          </w:tcPr>
+          <w:p>
+            <w:pPr>
+              <w:pStyle w:val="NormalnyWeb"/>
+              <w:spacing w:line="360" w:lineRule="auto"/>
+              <w:jc w:val="both"/>
+              <w:rPr>
+                <w:b/>
+                <w:bCs/>
+                <w:i w:val="0"/>
+                <w:iCs w:val="0"/>
+                <w:sz w:val="22"/>
+                <w:szCs w:val="22"/>
+              </w:rPr>
+            </w:pPr>
+            <w:r>
+              <w:rPr>
+                <w:b/>
+                <w:bCs/>
+                <w:i w:val="0"/>
+                <w:iCs w:val="0"/>
+                <w:sz w:val="22"/>
+                <w:szCs w:val="22"/>
+              </w:rPr>
+              <w:t>Aktualizacja wykresu</w:t>
+            </w:r>
+          </w:p>
+        </w:tc>
+        <w:tc>
+          <w:tcPr>
+            <w:tcW w:w="1701" w:type="dxa"/>
+          </w:tcPr>
+          <w:p>
+            <w:pPr>
+              <w:pStyle w:val="NormalnyWeb"/>
+              <w:spacing w:line="360" w:lineRule="auto"/>
+              <w:jc w:val="both"/>
+              <w:cnfStyle w:val="000000000000" w:firstRow="0" w:lastRow="0" w:firstColumn="0" w:lastColumn="0" w:oddVBand="0" w:evenVBand="0" w:oddHBand="0" w:evenHBand="0" w:firstRowFirstColumn="0" w:firstRowLastColumn="0" w:lastRowFirstColumn="0" w:lastRowLastColumn="0"/>
+              <w:rPr>
+                <w:sz w:val="22"/>
+                <w:szCs w:val="22"/>
+              </w:rPr>
+            </w:pPr>
+            <w:r>
+              <w:rPr>
+                <w:sz w:val="22"/>
+                <w:szCs w:val="22"/>
+              </w:rPr>
+              <w:t>co 5 próbek</w:t>
+            </w:r>
+          </w:p>
+        </w:tc>
+        <w:tc>
+          <w:tcPr>
+            <w:tcW w:w="1701" w:type="dxa"/>
+          </w:tcPr>
+          <w:p>
+            <w:pPr>
+              <w:pStyle w:val="NormalnyWeb"/>
+              <w:spacing w:line="360" w:lineRule="auto"/>
+              <w:jc w:val="both"/>
+              <w:cnfStyle w:val="000000000000" w:firstRow="0" w:lastRow="0" w:firstColumn="0" w:lastColumn="0" w:oddVBand="0" w:evenVBand="0" w:oddHBand="0" w:evenHBand="0" w:firstRowFirstColumn="0" w:firstRowLastColumn="0" w:lastRowFirstColumn="0" w:lastRowLastColumn="0"/>
+              <w:rPr>
+                <w:sz w:val="22"/>
+                <w:szCs w:val="22"/>
+              </w:rPr>
+            </w:pPr>
+            <w:r>
+              <w:rPr>
+                <w:sz w:val="22"/>
+                <w:szCs w:val="22"/>
+              </w:rPr>
+              <w:t>~72 Hz</w:t>
+            </w:r>
+          </w:p>
+        </w:tc>
+        <w:tc>
+          <w:tcPr>
+            <w:tcW w:w="3250" w:type="dxa"/>
+          </w:tcPr>
+          <w:p>
+            <w:pPr>
+              <w:pStyle w:val="NormalnyWeb"/>
+              <w:spacing w:line="360" w:lineRule="auto"/>
+              <w:jc w:val="both"/>
+              <w:cnfStyle w:val="000000000000" w:firstRow="0" w:lastRow="0" w:firstColumn="0" w:lastColumn="0" w:oddVBand="0" w:evenVBand="0" w:oddHBand="0" w:evenHBand="0" w:firstRowFirstColumn="0" w:firstRowLastColumn="0" w:lastRowFirstColumn="0" w:lastRowLastColumn="0"/>
+              <w:rPr>
+                <w:sz w:val="22"/>
+                <w:szCs w:val="22"/>
+              </w:rPr>
+            </w:pPr>
+            <w:r>
+              <w:rPr>
+                <w:sz w:val="22"/>
+                <w:szCs w:val="22"/>
+              </w:rPr>
+              <w:t>Płynna animacja dla oka</w:t>
+            </w:r>
+          </w:p>
+        </w:tc>
+      </w:tr>
+      <w:tr>
+        <w:tc>
+          <w:tcPr>
+            <w:cnfStyle w:val="001000000000" w:firstRow="0" w:lastRow="0" w:firstColumn="1" w:lastColumn="0" w:oddVBand="0" w:evenVBand="0" w:oddHBand="0" w:evenHBand="0" w:firstRowFirstColumn="0" w:firstRowLastColumn="0" w:lastRowFirstColumn="0" w:lastRowLastColumn="0"/>
+            <w:tcW w:w="2410" w:type="dxa"/>
+          </w:tcPr>
+          <w:p>
+            <w:pPr>
+              <w:pStyle w:val="NormalnyWeb"/>
+              <w:spacing w:line="360" w:lineRule="auto"/>
+              <w:jc w:val="left"/>
+              <w:rPr>
+                <w:b/>
+                <w:bCs/>
+                <w:i w:val="0"/>
+                <w:iCs w:val="0"/>
+                <w:sz w:val="22"/>
+                <w:szCs w:val="22"/>
+              </w:rPr>
+            </w:pPr>
+            <w:r>
+              <w:rPr>
+                <w:b/>
+                <w:bCs/>
+                <w:i w:val="0"/>
+                <w:iCs w:val="0"/>
+                <w:sz w:val="22"/>
+                <w:szCs w:val="22"/>
+              </w:rPr>
+              <w:t>Detekcja QRS + klasyfikacja</w:t>
+            </w:r>
+          </w:p>
+        </w:tc>
+        <w:tc>
+          <w:tcPr>
+            <w:tcW w:w="1701" w:type="dxa"/>
+          </w:tcPr>
+          <w:p>
+            <w:pPr>
+              <w:pStyle w:val="NormalnyWeb"/>
+              <w:spacing w:line="360" w:lineRule="auto"/>
+              <w:jc w:val="both"/>
+              <w:cnfStyle w:val="000000000000" w:firstRow="0" w:lastRow="0" w:firstColumn="0" w:lastColumn="0" w:oddVBand="0" w:evenVBand="0" w:oddHBand="0" w:evenHBand="0" w:firstRowFirstColumn="0" w:firstRowLastColumn="0" w:lastRowFirstColumn="0" w:lastRowLastColumn="0"/>
+              <w:rPr>
+                <w:sz w:val="22"/>
+                <w:szCs w:val="22"/>
+              </w:rPr>
+            </w:pPr>
+            <w:r>
+              <w:rPr>
+                <w:sz w:val="22"/>
+                <w:szCs w:val="22"/>
+              </w:rPr>
+              <w:t>co 50 próbek</w:t>
+            </w:r>
+          </w:p>
+        </w:tc>
+        <w:tc>
+          <w:tcPr>
+            <w:tcW w:w="1701" w:type="dxa"/>
+          </w:tcPr>
+          <w:p>
+            <w:pPr>
+              <w:pStyle w:val="NormalnyWeb"/>
+              <w:spacing w:line="360" w:lineRule="auto"/>
+              <w:jc w:val="both"/>
+              <w:cnfStyle w:val="000000000000" w:firstRow="0" w:lastRow="0" w:firstColumn="0" w:lastColumn="0" w:oddVBand="0" w:evenVBand="0" w:oddHBand="0" w:evenHBand="0" w:firstRowFirstColumn="0" w:firstRowLastColumn="0" w:lastRowFirstColumn="0" w:lastRowLastColumn="0"/>
+              <w:rPr>
+                <w:sz w:val="22"/>
+                <w:szCs w:val="22"/>
+              </w:rPr>
+            </w:pPr>
+            <w:r>
+              <w:rPr>
+                <w:sz w:val="22"/>
+                <w:szCs w:val="22"/>
+              </w:rPr>
+              <w:t>~7,2 Hz</w:t>
+            </w:r>
+          </w:p>
+        </w:tc>
+        <w:tc>
+          <w:tcPr>
+            <w:tcW w:w="3250" w:type="dxa"/>
+          </w:tcPr>
+          <w:p>
+            <w:pPr>
+              <w:pStyle w:val="NormalnyWeb"/>
+              <w:spacing w:line="360" w:lineRule="auto"/>
+              <w:cnfStyle w:val="000000000000" w:firstRow="0" w:lastRow="0" w:firstColumn="0" w:lastColumn="0" w:oddVBand="0" w:evenVBand="0" w:oddHBand="0" w:evenHBand="0" w:firstRowFirstColumn="0" w:firstRowLastColumn="0" w:lastRowFirstColumn="0" w:lastRowLastColumn="0"/>
+              <w:rPr>
+                <w:sz w:val="22"/>
+                <w:szCs w:val="22"/>
+              </w:rPr>
+            </w:pPr>
+            <w:r>
+              <w:rPr>
+                <w:sz w:val="22"/>
+                <w:szCs w:val="22"/>
+              </w:rPr>
+              <w:t>Ograniczenie kosztu obliczeniowego</w:t>
+            </w:r>
+          </w:p>
+        </w:tc>
+      </w:tr>
+    </w:tbl>
+    <w:p>
+      <w:pPr>
+        <w:pStyle w:val="NormalnyWeb"/>
+        <w:spacing w:before="0" w:beforeAutospacing="0" w:after="0" w:afterAutospacing="0" w:line="360" w:lineRule="auto"/>
+        <w:jc w:val="both"/>
+        <w:rPr>
+          <w:rFonts w:ascii="Cambria Math" w:hAnsi="Cambria Math"/>
+          <w:lang w:val="en-US"/>
+        </w:rPr>
+      </w:pPr>
+      <w:r>
+        <w:rPr>
+          <w:rFonts w:ascii="Cambria Math" w:hAnsi="Cambria Math"/>
+          <w:lang w:val="en-US"/>
+        </w:rPr>
+        <w:t xml:space="preserve">  </w:t>
+      </w:r>
+    </w:p>
+    <w:p>
+      <w:pPr>
+        <w:pStyle w:val="NormalnyWeb"/>
+        <w:spacing w:before="0" w:beforeAutospacing="0" w:after="0" w:afterAutospacing="0" w:line="360" w:lineRule="auto"/>
+        <w:jc w:val="both"/>
+        <w:rPr>
+          <w:rFonts w:ascii="Consolas" w:hAnsi="Consolas"/>
+          <w:sz w:val="18"/>
+          <w:szCs w:val="18"/>
+          <w:lang w:val="en-US"/>
+        </w:rPr>
+      </w:pPr>
+      <w:r>
+        <w:rPr>
+          <w:rFonts w:ascii="Consolas" w:hAnsi="Consolas"/>
+          <w:sz w:val="18"/>
+          <w:szCs w:val="18"/>
+          <w:lang w:val="en-US"/>
+        </w:rPr>
+        <w:t>if s_idx % 5 == 0 and len(plot_buffer) &gt; 1:</w:t>
+      </w:r>
+    </w:p>
+    <w:p>
+      <w:pPr>
+        <w:pStyle w:val="NormalnyWeb"/>
+        <w:spacing w:before="0" w:beforeAutospacing="0" w:after="0" w:afterAutospacing="0" w:line="360" w:lineRule="auto"/>
+        <w:jc w:val="both"/>
+        <w:rPr>
+          <w:rFonts w:ascii="Consolas" w:hAnsi="Consolas"/>
+          <w:sz w:val="18"/>
+          <w:szCs w:val="18"/>
+          <w:lang w:val="en-US"/>
+        </w:rPr>
+      </w:pPr>
+      <w:r>
+        <w:rPr>
+          <w:rFonts w:ascii="Consolas" w:hAnsi="Consolas"/>
+          <w:sz w:val="18"/>
+          <w:szCs w:val="18"/>
+          <w:lang w:val="en-US"/>
+        </w:rPr>
+        <w:t xml:space="preserve">      # rysowanie ...</w:t>
+      </w:r>
+    </w:p>
+    <w:p>
+      <w:pPr>
+        <w:pStyle w:val="NormalnyWeb"/>
+        <w:spacing w:before="0" w:beforeAutospacing="0" w:after="0" w:afterAutospacing="0" w:line="360" w:lineRule="auto"/>
+        <w:jc w:val="both"/>
+        <w:rPr>
+          <w:rFonts w:ascii="Consolas" w:hAnsi="Consolas"/>
+          <w:sz w:val="18"/>
+          <w:szCs w:val="18"/>
+          <w:lang w:val="en-US"/>
+        </w:rPr>
+      </w:pPr>
+    </w:p>
+    <w:p>
+      <w:pPr>
+        <w:pStyle w:val="NormalnyWeb"/>
+        <w:spacing w:before="0" w:beforeAutospacing="0" w:after="0" w:afterAutospacing="0" w:line="360" w:lineRule="auto"/>
+        <w:jc w:val="both"/>
+        <w:rPr>
+          <w:rFonts w:ascii="Consolas" w:hAnsi="Consolas"/>
+          <w:sz w:val="18"/>
+          <w:szCs w:val="18"/>
+          <w:lang w:val="en-US"/>
+        </w:rPr>
+      </w:pPr>
+      <w:r>
+        <w:rPr>
+          <w:rFonts w:ascii="Consolas" w:hAnsi="Consolas"/>
+          <w:sz w:val="18"/>
+          <w:szCs w:val="18"/>
+          <w:lang w:val="en-US"/>
+        </w:rPr>
+        <w:t>if samples_since_pt &gt;= PT_RUN_EVERY and len(pt_buf_ch0) &gt;= WINDOW_SIZE * 2:</w:t>
+      </w:r>
+    </w:p>
+    <w:p>
+      <w:pPr>
+        <w:pStyle w:val="NormalnyWeb"/>
+        <w:spacing w:before="0" w:beforeAutospacing="0" w:after="0" w:afterAutospacing="0" w:line="360" w:lineRule="auto"/>
+        <w:jc w:val="both"/>
+        <w:rPr>
+          <w:rFonts w:ascii="Consolas" w:hAnsi="Consolas"/>
+          <w:sz w:val="18"/>
+          <w:szCs w:val="18"/>
+        </w:rPr>
+      </w:pPr>
+      <w:r>
+        <w:rPr>
+          <w:rFonts w:ascii="Consolas" w:hAnsi="Consolas"/>
+          <w:sz w:val="18"/>
+          <w:szCs w:val="18"/>
+          <w:lang w:val="en-US"/>
+        </w:rPr>
+        <w:t xml:space="preserve">      </w:t>
+      </w:r>
+      <w:r>
+        <w:rPr>
+          <w:rFonts w:ascii="Consolas" w:hAnsi="Consolas"/>
+          <w:sz w:val="18"/>
+          <w:szCs w:val="18"/>
+        </w:rPr>
+        <w:t># detekcja QRS + klasyfikacja AI ...</w:t>
+      </w:r>
+    </w:p>
+    <w:p>
+      <w:pPr>
+        <w:pStyle w:val="NormalnyWeb"/>
+        <w:spacing w:line="360" w:lineRule="auto"/>
+        <w:jc w:val="both"/>
+        <w:rPr>
+          <w:rFonts w:ascii="Cambria Math" w:hAnsi="Cambria Math"/>
+        </w:rPr>
+      </w:pPr>
+    </w:p>
+    <w:p>
+      <w:pPr>
+        <w:pStyle w:val="NormalnyWeb"/>
+        <w:spacing w:line="360" w:lineRule="auto"/>
+        <w:jc w:val="both"/>
+        <w:rPr>
+          <w:rFonts w:ascii="Cambria Math" w:hAnsi="Cambria Math"/>
+        </w:rPr>
+      </w:pPr>
+      <w:r>
+        <w:rPr>
+          <w:rFonts w:ascii="Cambria Math" w:hAnsi="Cambria Math"/>
+        </w:rPr>
+        <w:t xml:space="preserve"> System adnotacji na wykresie</w:t>
+      </w:r>
+    </w:p>
+    <w:p>
+      <w:pPr>
+        <w:pStyle w:val="NormalnyWeb"/>
+        <w:spacing w:line="360" w:lineRule="auto"/>
+        <w:jc w:val="both"/>
+        <w:rPr>
+          <w:rFonts w:ascii="Cambria Math" w:hAnsi="Cambria Math"/>
+        </w:rPr>
+      </w:pPr>
+      <w:r>
+        <w:rPr>
+          <w:rFonts w:ascii="Cambria Math" w:hAnsi="Cambria Math"/>
+        </w:rPr>
+        <w:t>Najistotniejszym elementem wizualizacji jest nakładanie wyników klasyfikacji bezpośrednio na przebieg sygnału.</w:t>
+      </w:r>
+      <w:r>
+        <w:rPr>
+          <w:rFonts w:ascii="Cambria Math" w:hAnsi="Cambria Math"/>
+        </w:rPr>
+        <w:t xml:space="preserve"> </w:t>
+      </w:r>
+      <w:r>
+        <w:rPr>
+          <w:rFonts w:ascii="Cambria Math" w:hAnsi="Cambria Math"/>
+        </w:rPr>
+        <w:t>Ponieważ wykres jest ruchomy (nowe próbki przesuwają sygnał w lewo), pozycja X każdej adnotacji zmienia się przy</w:t>
+      </w:r>
+      <w:r>
+        <w:rPr>
+          <w:rFonts w:ascii="Cambria Math" w:hAnsi="Cambria Math"/>
+        </w:rPr>
+        <w:t xml:space="preserve"> </w:t>
+      </w:r>
+      <w:r>
+        <w:rPr>
+          <w:rFonts w:ascii="Cambria Math" w:hAnsi="Cambria Math"/>
+        </w:rPr>
+        <w:t>każdym odświeżeniu. Implementacja rozwiązuje ten problem przez system globalnych indeksów próbek. Każde sklasyfikowane pobudzenie jest zapisywane do listy pending_annotations jako krotka (g_idx, label, prob), gdzie g_idx to bezwzględny numer próbki w strumieniu</w:t>
+      </w:r>
+      <w:r>
+        <w:rPr>
+          <w:rFonts w:ascii="Cambria Math" w:hAnsi="Cambria Math"/>
+        </w:rPr>
+        <w:t xml:space="preserve">. </w:t>
+      </w:r>
+      <w:r>
+        <w:rPr>
+          <w:rFonts w:ascii="Cambria Math" w:hAnsi="Cambria Math"/>
+        </w:rPr>
+        <w:t>Przy każdym odświeżeniu wykresu obliczana jest</w:t>
+      </w:r>
+      <w:r>
+        <w:rPr>
+          <w:rFonts w:ascii="Cambria Math" w:hAnsi="Cambria Math"/>
+        </w:rPr>
+        <w:t xml:space="preserve"> </w:t>
+      </w:r>
+      <w:r>
+        <w:rPr>
+          <w:rFonts w:ascii="Cambria Math" w:hAnsi="Cambria Math"/>
+        </w:rPr>
+        <w:t xml:space="preserve"> aktualna pozycja X adnotacji względem początku widoku:</w:t>
+      </w:r>
+    </w:p>
+    <w:p>
+      <w:pPr>
+        <w:pStyle w:val="NormalnyWeb"/>
+        <w:spacing w:before="0" w:beforeAutospacing="0" w:after="0" w:afterAutospacing="0" w:line="360" w:lineRule="auto"/>
+        <w:jc w:val="both"/>
+        <w:rPr>
+          <w:rFonts w:ascii="Consolas" w:hAnsi="Consolas"/>
+          <w:sz w:val="18"/>
+          <w:szCs w:val="18"/>
+          <w:lang w:val="en-US"/>
+        </w:rPr>
+      </w:pPr>
+      <w:r>
+        <w:rPr>
+          <w:rFonts w:ascii="Cambria Math" w:hAnsi="Cambria Math"/>
+        </w:rPr>
+        <w:t xml:space="preserve">  </w:t>
+      </w:r>
+      <w:r>
+        <w:rPr>
+          <w:rFonts w:ascii="Consolas" w:hAnsi="Consolas"/>
+          <w:sz w:val="18"/>
+          <w:szCs w:val="18"/>
+          <w:lang w:val="en-US"/>
+        </w:rPr>
+        <w:t>buf_start_global = s_idx - len(plot_buffer) + 1</w:t>
+      </w:r>
+    </w:p>
+    <w:p>
+      <w:pPr>
+        <w:pStyle w:val="NormalnyWeb"/>
+        <w:spacing w:before="0" w:beforeAutospacing="0" w:after="0" w:afterAutospacing="0" w:line="360" w:lineRule="auto"/>
+        <w:jc w:val="both"/>
+        <w:rPr>
+          <w:rFonts w:ascii="Consolas" w:hAnsi="Consolas"/>
+          <w:sz w:val="18"/>
+          <w:szCs w:val="18"/>
+          <w:lang w:val="en-US"/>
+        </w:rPr>
+      </w:pPr>
+      <w:r>
+        <w:rPr>
+          <w:rFonts w:ascii="Consolas" w:hAnsi="Consolas"/>
+          <w:sz w:val="18"/>
+          <w:szCs w:val="18"/>
+          <w:lang w:val="en-US"/>
+        </w:rPr>
+        <w:t xml:space="preserve"> x_pos = g_idx - buf_start_global</w:t>
+      </w:r>
+    </w:p>
+    <w:p>
+      <w:pPr>
+        <w:pStyle w:val="NormalnyWeb"/>
+        <w:spacing w:line="360" w:lineRule="auto"/>
+        <w:jc w:val="both"/>
+        <w:rPr>
+          <w:rFonts w:ascii="Cambria Math" w:hAnsi="Cambria Math"/>
+          <w:lang w:val="en-US"/>
+        </w:rPr>
+      </w:pPr>
+    </w:p>
+    <w:p>
+      <w:pPr>
+        <w:pStyle w:val="NormalnyWeb"/>
+        <w:spacing w:line="360" w:lineRule="auto"/>
+        <w:jc w:val="both"/>
+        <w:rPr>
+          <w:rFonts w:ascii="Cambria Math" w:hAnsi="Cambria Math"/>
+        </w:rPr>
+      </w:pPr>
+      <w:r>
+        <w:rPr>
+          <w:rFonts w:ascii="Cambria Math" w:hAnsi="Cambria Math"/>
+        </w:rPr>
+        <w:lastRenderedPageBreak/>
+        <w:t>Adnotacje, których pozycja X wykroczyła poza lewy kraniec okna (x_pos &lt; 0), są usuwane z listy</w:t>
+      </w:r>
+      <w:r>
+        <w:rPr>
+          <w:rFonts w:ascii="Cambria Math" w:hAnsi="Cambria Math"/>
+        </w:rPr>
+        <w:t xml:space="preserve"> natomiast </w:t>
+      </w:r>
+      <w:r>
+        <w:rPr>
+          <w:rFonts w:ascii="Cambria Math" w:hAnsi="Cambria Math"/>
+        </w:rPr>
+        <w:t>widoczne</w:t>
+      </w:r>
+      <w:r>
+        <w:rPr>
+          <w:rFonts w:ascii="Cambria Math" w:hAnsi="Cambria Math"/>
+        </w:rPr>
+        <w:t xml:space="preserve"> adnotacje</w:t>
+      </w:r>
+      <w:r>
+        <w:rPr>
+          <w:rFonts w:ascii="Cambria Math" w:hAnsi="Cambria Math"/>
+        </w:rPr>
+        <w:t xml:space="preserve"> są</w:t>
+      </w:r>
+      <w:r>
+        <w:rPr>
+          <w:rFonts w:ascii="Cambria Math" w:hAnsi="Cambria Math"/>
+        </w:rPr>
+        <w:t xml:space="preserve"> </w:t>
+      </w:r>
+      <w:r>
+        <w:rPr>
+          <w:rFonts w:ascii="Cambria Math" w:hAnsi="Cambria Math"/>
+        </w:rPr>
+        <w:t>przerysowywane jako:</w:t>
+      </w:r>
+    </w:p>
+    <w:p>
+      <w:pPr>
+        <w:pStyle w:val="NormalnyWeb"/>
+        <w:numPr>
+          <w:ilvl w:val="0"/>
+          <w:numId w:val="16"/>
+        </w:numPr>
+        <w:spacing w:line="360" w:lineRule="auto"/>
+        <w:jc w:val="both"/>
+        <w:rPr>
+          <w:rFonts w:ascii="Cambria Math" w:hAnsi="Cambria Math"/>
+        </w:rPr>
+      </w:pPr>
+      <w:r>
+        <w:rPr>
+          <w:rFonts w:ascii="Cambria Math" w:hAnsi="Cambria Math"/>
+        </w:rPr>
+        <w:t>pionowa przerywana linia (ax.axvline) – zielona dla klasy N (Normal), czerwona dla pozostałych klas arytmii,</w:t>
+      </w:r>
+    </w:p>
+    <w:p>
+      <w:pPr>
+        <w:pStyle w:val="NormalnyWeb"/>
+        <w:numPr>
+          <w:ilvl w:val="0"/>
+          <w:numId w:val="16"/>
+        </w:numPr>
+        <w:spacing w:line="360" w:lineRule="auto"/>
+        <w:jc w:val="both"/>
+        <w:rPr>
+          <w:rFonts w:ascii="Cambria Math" w:hAnsi="Cambria Math"/>
+        </w:rPr>
+      </w:pPr>
+      <w:r>
+        <w:rPr>
+          <w:rFonts w:ascii="Cambria Math" w:hAnsi="Cambria Math"/>
+        </w:rPr>
+        <w:t>etykieta tekstowa (ax.text) z nazwą klasy i prawdopodobieństwem w formacie</w:t>
+      </w:r>
+      <w:r>
+        <w:rPr>
+          <w:rFonts w:ascii="Cambria Math" w:hAnsi="Cambria Math"/>
+        </w:rPr>
+        <w:t xml:space="preserve">: </w:t>
+      </w:r>
+      <m:oMath>
+        <m:f>
+          <m:fPr>
+            <m:ctrlPr>
+              <w:rPr>
+                <w:rFonts w:ascii="Cambria Math" w:hAnsi="Cambria Math"/>
+                <w:i/>
+              </w:rPr>
+            </m:ctrlPr>
+          </m:fPr>
+          <m:num>
+            <m:r>
+              <w:rPr>
+                <w:rFonts w:ascii="Cambria Math" w:hAnsi="Cambria Math"/>
+              </w:rPr>
+              <m:t>Klasa AMMI</m:t>
+            </m:r>
+          </m:num>
+          <m:den>
+            <m:r>
+              <w:rPr>
+                <w:rFonts w:ascii="Cambria Math" w:hAnsi="Cambria Math"/>
+              </w:rPr>
+              <m:t>prawdopodobieństwo</m:t>
+            </m:r>
+          </m:den>
+        </m:f>
+      </m:oMath>
+    </w:p>
+    <w:p>
+      <w:pPr>
+        <w:pStyle w:val="NormalnyWeb"/>
+        <w:spacing w:line="360" w:lineRule="auto"/>
+        <w:jc w:val="both"/>
+        <w:rPr>
+          <w:rFonts w:ascii="Cambria Math" w:hAnsi="Cambria Math"/>
+        </w:rPr>
+      </w:pPr>
+    </w:p>
+    <w:p>
+      <w:pPr>
+        <w:pStyle w:val="NormalnyWeb"/>
+        <w:spacing w:before="0" w:beforeAutospacing="0" w:after="0" w:afterAutospacing="0" w:line="360" w:lineRule="auto"/>
+        <w:jc w:val="both"/>
+        <w:rPr>
+          <w:rFonts w:ascii="Consolas" w:hAnsi="Consolas"/>
+          <w:sz w:val="18"/>
+          <w:szCs w:val="18"/>
+          <w:lang w:val="en-US"/>
+        </w:rPr>
+      </w:pPr>
+      <w:r>
+        <w:rPr>
+          <w:rFonts w:ascii="Cambria Math" w:hAnsi="Cambria Math"/>
+        </w:rPr>
+        <w:t xml:space="preserve">  </w:t>
+      </w:r>
+      <w:r>
+        <w:rPr>
+          <w:rFonts w:ascii="Consolas" w:hAnsi="Consolas"/>
+          <w:sz w:val="18"/>
+          <w:szCs w:val="18"/>
+          <w:lang w:val="en-US"/>
+        </w:rPr>
+        <w:t>color = 'green' if label == 'N' else 'red'</w:t>
+      </w:r>
+    </w:p>
+    <w:p>
+      <w:pPr>
+        <w:pStyle w:val="NormalnyWeb"/>
+        <w:spacing w:before="0" w:beforeAutospacing="0" w:after="0" w:afterAutospacing="0" w:line="360" w:lineRule="auto"/>
+        <w:jc w:val="both"/>
+        <w:rPr>
+          <w:rFonts w:ascii="Consolas" w:hAnsi="Consolas"/>
+          <w:sz w:val="18"/>
+          <w:szCs w:val="18"/>
+          <w:lang w:val="en-US"/>
+        </w:rPr>
+      </w:pPr>
+      <w:r>
+        <w:rPr>
+          <w:rFonts w:ascii="Consolas" w:hAnsi="Consolas"/>
+          <w:sz w:val="18"/>
+          <w:szCs w:val="18"/>
+          <w:lang w:val="en-US"/>
+        </w:rPr>
+        <w:t xml:space="preserve"> vl = ax.axvline(x=x_pos, color=color, linestyle='--', alpha=0.4, lw=1)</w:t>
+      </w:r>
+    </w:p>
+    <w:p>
+      <w:pPr>
+        <w:pStyle w:val="NormalnyWeb"/>
+        <w:spacing w:before="0" w:beforeAutospacing="0" w:after="0" w:afterAutospacing="0" w:line="360" w:lineRule="auto"/>
+        <w:jc w:val="both"/>
+        <w:rPr>
+          <w:rFonts w:ascii="Consolas" w:hAnsi="Consolas"/>
+          <w:sz w:val="18"/>
+          <w:szCs w:val="18"/>
+          <w:lang w:val="en-US"/>
+        </w:rPr>
+      </w:pPr>
+      <w:r>
+        <w:rPr>
+          <w:rFonts w:ascii="Consolas" w:hAnsi="Consolas"/>
+          <w:sz w:val="18"/>
+          <w:szCs w:val="18"/>
+          <w:lang w:val="en-US"/>
+        </w:rPr>
+        <w:t xml:space="preserve"> tx = ax.text(x_pos, 1.6, f"{label}\n{prob:.2f}",</w:t>
+      </w:r>
+    </w:p>
+    <w:p>
+      <w:pPr>
+        <w:pStyle w:val="NormalnyWeb"/>
+        <w:spacing w:before="0" w:beforeAutospacing="0" w:after="0" w:afterAutospacing="0" w:line="360" w:lineRule="auto"/>
+        <w:jc w:val="both"/>
+        <w:rPr>
+          <w:rFonts w:ascii="Consolas" w:hAnsi="Consolas"/>
+          <w:sz w:val="18"/>
+          <w:szCs w:val="18"/>
+          <w:lang w:val="en-US"/>
+        </w:rPr>
+      </w:pPr>
+      <w:r>
+        <w:rPr>
+          <w:rFonts w:ascii="Consolas" w:hAnsi="Consolas"/>
+          <w:sz w:val="18"/>
+          <w:szCs w:val="18"/>
+          <w:lang w:val="en-US"/>
+        </w:rPr>
+        <w:t xml:space="preserve">               color=color, fontweight='bold', ha='center', fontsize=8)</w:t>
+      </w:r>
+    </w:p>
+    <w:p>
+      <w:pPr>
+        <w:pStyle w:val="NormalnyWeb"/>
+        <w:spacing w:before="0" w:beforeAutospacing="0" w:after="0" w:afterAutospacing="0" w:line="360" w:lineRule="auto"/>
+        <w:jc w:val="both"/>
+        <w:rPr>
+          <w:rFonts w:ascii="Consolas" w:hAnsi="Consolas"/>
+          <w:sz w:val="18"/>
+          <w:szCs w:val="18"/>
+          <w:lang w:val="en-US"/>
+        </w:rPr>
+      </w:pPr>
+      <w:r>
+        <w:rPr>
+          <w:rFonts w:ascii="Consolas" w:hAnsi="Consolas"/>
+          <w:sz w:val="18"/>
+          <w:szCs w:val="18"/>
+          <w:lang w:val="en-US"/>
+        </w:rPr>
+        <w:t xml:space="preserve"> current_artists.extend([vl, tx])</w:t>
+      </w:r>
+    </w:p>
+    <w:p>
+      <w:pPr>
+        <w:pStyle w:val="NormalnyWeb"/>
+        <w:spacing w:line="360" w:lineRule="auto"/>
+        <w:jc w:val="both"/>
+        <w:rPr>
+          <w:rFonts w:ascii="Cambria Math" w:hAnsi="Cambria Math"/>
+        </w:rPr>
+      </w:pPr>
+      <w:r>
+        <w:rPr>
+          <w:rFonts w:ascii="Cambria Math" w:hAnsi="Cambria Math"/>
+        </w:rPr>
+        <w:t>Przed każdym odświeżeniem wszystkie poprzednie artyści adnotacji są usuwane przez wywołanie artist.remove(), a lista current_artists jest czyszczona. Gwarantuje to, że w danym momencie na wykresie widoczna jest tylko aktualna pozycja każdej adnotacji, bez nakładania się kopii z poprzednich klatek.</w:t>
+      </w:r>
+    </w:p>
+    <w:p>
+      <w:pPr>
+        <w:pStyle w:val="NormalnyWeb"/>
+        <w:spacing w:line="360" w:lineRule="auto"/>
+        <w:jc w:val="both"/>
+        <w:rPr>
+          <w:rFonts w:ascii="Cambria Math" w:hAnsi="Cambria Math"/>
+        </w:rPr>
+      </w:pPr>
+      <w:r>
+        <w:rPr>
+          <w:rFonts w:ascii="Cambria Math" w:hAnsi="Cambria Math"/>
+        </w:rPr>
+        <w:t>Pętla detekcji i klasyfikacji</w:t>
+      </w:r>
+    </w:p>
+    <w:p>
+      <w:pPr>
+        <w:pStyle w:val="NormalnyWeb"/>
+        <w:spacing w:line="360" w:lineRule="auto"/>
+        <w:jc w:val="both"/>
+        <w:rPr>
+          <w:rFonts w:ascii="Cambria Math" w:hAnsi="Cambria Math"/>
+        </w:rPr>
+      </w:pPr>
+      <w:r>
+        <w:rPr>
+          <w:rFonts w:ascii="Cambria Math" w:hAnsi="Cambria Math"/>
+        </w:rPr>
+        <w:t xml:space="preserve">Po każdym </w:t>
+      </w:r>
+      <w:r>
+        <w:rPr>
+          <w:rFonts w:ascii="Cambria Math" w:hAnsi="Cambria Math"/>
+        </w:rPr>
+        <w:t>pięćdziesiątym</w:t>
+      </w:r>
+      <w:r>
+        <w:rPr>
+          <w:rFonts w:ascii="Cambria Math" w:hAnsi="Cambria Math"/>
+        </w:rPr>
+        <w:t xml:space="preserve"> odebranym sygnale uruchamiana jest detekcja QRS algorytmem Pan-Tompkinsa na bieżącej zawartości bufora (do 2880 próbek). Zwrócone indeksy lokalne peaków są przeliczane na indeksy globalne, a następnie dla każdego piku:</w:t>
+      </w:r>
+    </w:p>
+    <w:p>
+      <w:pPr>
+        <w:pStyle w:val="NormalnyWeb"/>
+        <w:numPr>
+          <w:ilvl w:val="2"/>
+          <w:numId w:val="18"/>
+        </w:numPr>
+        <w:spacing w:line="360" w:lineRule="auto"/>
+        <w:ind w:left="360"/>
+        <w:jc w:val="both"/>
+        <w:rPr>
+          <w:rFonts w:ascii="Cambria Math" w:hAnsi="Cambria Math"/>
+        </w:rPr>
+      </w:pPr>
+      <w:r>
+        <w:rPr>
+          <w:rFonts w:ascii="Cambria Math" w:hAnsi="Cambria Math"/>
+        </w:rPr>
+        <w:t>Sprawdzane są warunki brzegowe (pik zbyt blisko krawędzi bufora – brakuje próbek na pełne okno 360-punktowe).</w:t>
+      </w:r>
+    </w:p>
+    <w:p>
+      <w:pPr>
+        <w:pStyle w:val="NormalnyWeb"/>
+        <w:numPr>
+          <w:ilvl w:val="2"/>
+          <w:numId w:val="18"/>
+        </w:numPr>
+        <w:spacing w:line="360" w:lineRule="auto"/>
+        <w:ind w:left="360"/>
+        <w:jc w:val="both"/>
+        <w:rPr>
+          <w:rFonts w:ascii="Cambria Math" w:hAnsi="Cambria Math"/>
+        </w:rPr>
+      </w:pPr>
+      <w:r>
+        <w:rPr>
+          <w:rFonts w:ascii="Cambria Math" w:hAnsi="Cambria Math"/>
+        </w:rPr>
+        <w:t>Stosowany jest okres refrakcji (MIN_PEAK_DISTANCE = 108 próbek ≈ 300 ms) – piki wykryte w zbyt małej odległości od</w:t>
+      </w:r>
+      <w:r>
+        <w:rPr>
+          <w:rFonts w:ascii="Cambria Math" w:hAnsi="Cambria Math"/>
+        </w:rPr>
+        <w:t xml:space="preserve"> </w:t>
+      </w:r>
+      <w:r>
+        <w:rPr>
+          <w:rFonts w:ascii="Cambria Math" w:hAnsi="Cambria Math"/>
+        </w:rPr>
+        <w:t>poprzednio sklasyfikowanego są pomijane, co zapobiega podwójnej klasyfikacji tego samego uderzenia.</w:t>
+      </w:r>
+    </w:p>
+    <w:p>
+      <w:pPr>
+        <w:pStyle w:val="NormalnyWeb"/>
+        <w:numPr>
+          <w:ilvl w:val="2"/>
+          <w:numId w:val="18"/>
+        </w:numPr>
+        <w:spacing w:line="360" w:lineRule="auto"/>
+        <w:ind w:left="360"/>
+        <w:jc w:val="both"/>
+        <w:rPr>
+          <w:rFonts w:ascii="Cambria Math" w:hAnsi="Cambria Math"/>
+        </w:rPr>
+      </w:pPr>
+      <w:r>
+        <w:rPr>
+          <w:rFonts w:ascii="Cambria Math" w:hAnsi="Cambria Math"/>
+        </w:rPr>
+        <w:t>Wycinane jest okno 360 próbek (180 przed i 180 po piku R) z obu kanałów.</w:t>
+      </w:r>
+    </w:p>
+    <w:p>
+      <w:pPr>
+        <w:pStyle w:val="NormalnyWeb"/>
+        <w:numPr>
+          <w:ilvl w:val="2"/>
+          <w:numId w:val="18"/>
+        </w:numPr>
+        <w:spacing w:line="360" w:lineRule="auto"/>
+        <w:ind w:left="360"/>
+        <w:jc w:val="both"/>
+        <w:rPr>
+          <w:rFonts w:ascii="Cambria Math" w:hAnsi="Cambria Math"/>
+        </w:rPr>
+      </w:pPr>
+      <w:r>
+        <w:rPr>
+          <w:rFonts w:ascii="Cambria Math" w:hAnsi="Cambria Math"/>
+        </w:rPr>
+        <w:t>Okno jest normalizowane statystykami z treningu (mean/std obliczone na zbiorze DS1).</w:t>
+      </w:r>
+    </w:p>
+    <w:p>
+      <w:pPr>
+        <w:pStyle w:val="NormalnyWeb"/>
+        <w:numPr>
+          <w:ilvl w:val="2"/>
+          <w:numId w:val="18"/>
+        </w:numPr>
+        <w:spacing w:line="360" w:lineRule="auto"/>
+        <w:ind w:left="360"/>
+        <w:jc w:val="both"/>
+        <w:rPr>
+          <w:rFonts w:ascii="Cambria Math" w:hAnsi="Cambria Math"/>
+        </w:rPr>
+      </w:pPr>
+      <w:r>
+        <w:rPr>
+          <w:rFonts w:ascii="Cambria Math" w:hAnsi="Cambria Math"/>
+        </w:rPr>
+        <w:lastRenderedPageBreak/>
+        <w:t>Model ResNet zwraca wektor prawdopodobieństw dla 5 klas AAMI; wybierana jest klasa z najwyższym prawdopodobieństwem.</w:t>
+      </w:r>
+    </w:p>
+    <w:p>
+      <w:pPr>
+        <w:pStyle w:val="NormalnyWeb"/>
+        <w:spacing w:before="0" w:beforeAutospacing="0" w:after="0" w:afterAutospacing="0" w:line="360" w:lineRule="auto"/>
+        <w:jc w:val="both"/>
+        <w:rPr>
+          <w:rFonts w:ascii="Consolas" w:hAnsi="Consolas"/>
+          <w:sz w:val="18"/>
+          <w:szCs w:val="18"/>
+          <w:lang w:val="en-US"/>
+        </w:rPr>
+      </w:pPr>
+      <w:r>
+        <w:rPr>
+          <w:rFonts w:ascii="Cambria Math" w:hAnsi="Cambria Math"/>
+          <w:lang w:val="en-US"/>
+        </w:rPr>
+        <w:t xml:space="preserve"> </w:t>
+      </w:r>
+      <w:r>
+        <w:rPr>
+          <w:rFonts w:ascii="Consolas" w:hAnsi="Consolas"/>
+          <w:sz w:val="18"/>
+          <w:szCs w:val="18"/>
+          <w:lang w:val="en-US"/>
+        </w:rPr>
+        <w:t>prediction = model.predict(x_in, verbose=0)</w:t>
+      </w:r>
+    </w:p>
+    <w:p>
+      <w:pPr>
+        <w:pStyle w:val="NormalnyWeb"/>
+        <w:spacing w:before="0" w:beforeAutospacing="0" w:after="0" w:afterAutospacing="0" w:line="360" w:lineRule="auto"/>
+        <w:jc w:val="both"/>
+        <w:rPr>
+          <w:rFonts w:ascii="Consolas" w:hAnsi="Consolas"/>
+          <w:sz w:val="18"/>
+          <w:szCs w:val="18"/>
+          <w:lang w:val="en-US"/>
+        </w:rPr>
+      </w:pPr>
+      <w:r>
+        <w:rPr>
+          <w:rFonts w:ascii="Consolas" w:hAnsi="Consolas"/>
+          <w:sz w:val="18"/>
+          <w:szCs w:val="18"/>
+          <w:lang w:val="en-US"/>
+        </w:rPr>
+        <w:t>class_idx  = int(np.argmax(prediction))</w:t>
+      </w:r>
+    </w:p>
+    <w:p>
+      <w:pPr>
+        <w:pStyle w:val="NormalnyWeb"/>
+        <w:spacing w:before="0" w:beforeAutospacing="0" w:after="0" w:afterAutospacing="0" w:line="360" w:lineRule="auto"/>
+        <w:jc w:val="both"/>
+        <w:rPr>
+          <w:rFonts w:ascii="Consolas" w:hAnsi="Consolas"/>
+          <w:sz w:val="18"/>
+          <w:szCs w:val="18"/>
+          <w:lang w:val="en-US"/>
+        </w:rPr>
+      </w:pPr>
+      <w:r>
+        <w:rPr>
+          <w:rFonts w:ascii="Consolas" w:hAnsi="Consolas"/>
+          <w:sz w:val="18"/>
+          <w:szCs w:val="18"/>
+          <w:lang w:val="en-US"/>
+        </w:rPr>
+        <w:t>l</w:t>
+      </w:r>
+      <w:r>
+        <w:rPr>
+          <w:rFonts w:ascii="Consolas" w:hAnsi="Consolas"/>
+          <w:sz w:val="18"/>
+          <w:szCs w:val="18"/>
+          <w:lang w:val="en-US"/>
+        </w:rPr>
+        <w:t>abel      = CLASS_MAP[class_idx]   # ['F','N','Q','S','V']</w:t>
+      </w:r>
+    </w:p>
+    <w:p>
+      <w:pPr>
+        <w:pStyle w:val="NormalnyWeb"/>
+        <w:spacing w:before="0" w:beforeAutospacing="0" w:after="0" w:afterAutospacing="0" w:line="360" w:lineRule="auto"/>
+        <w:jc w:val="both"/>
+        <w:rPr>
+          <w:rFonts w:ascii="Consolas" w:hAnsi="Consolas"/>
+          <w:sz w:val="18"/>
+          <w:szCs w:val="18"/>
+          <w:lang w:val="en-US"/>
+        </w:rPr>
+      </w:pPr>
+      <w:r>
+        <w:rPr>
+          <w:rFonts w:ascii="Consolas" w:hAnsi="Consolas"/>
+          <w:sz w:val="18"/>
+          <w:szCs w:val="18"/>
+          <w:lang w:val="en-US"/>
+        </w:rPr>
+        <w:t>prob       = float(prediction[0][class_idx])</w:t>
+      </w:r>
+    </w:p>
+    <w:p>
+      <w:pPr>
+        <w:pStyle w:val="NormalnyWeb"/>
+        <w:spacing w:line="360" w:lineRule="auto"/>
+        <w:jc w:val="both"/>
+        <w:rPr>
+          <w:rFonts w:ascii="Cambria Math" w:hAnsi="Cambria Math"/>
+        </w:rPr>
+      </w:pPr>
+      <w:r>
+        <w:rPr>
+          <w:rFonts w:ascii="Cambria Math" w:hAnsi="Cambria Math"/>
+        </w:rPr>
+        <w:t>Wynik jest drukowany do konsoli oraz dodawany do pending_annotations w celu wyświetlenia na wykresie.</w:t>
+      </w:r>
+    </w:p>
+    <w:p>
+      <w:pPr>
+        <w:pStyle w:val="NormalnyWeb"/>
+        <w:spacing w:line="360" w:lineRule="auto"/>
+        <w:jc w:val="both"/>
+        <w:rPr>
+          <w:rFonts w:ascii="Cambria Math" w:hAnsi="Cambria Math"/>
+          <w:lang w:val="en-US"/>
+        </w:rPr>
+      </w:pPr>
+      <w:r>
+        <w:rPr>
+          <w:rFonts w:ascii="Cambria Math" w:hAnsi="Cambria Math"/>
+        </w:rPr>
+        <w:t>Program działa w nieskończonej pętli for message in consumer. Zatrzymanie następuje przez KeyboardInterrupt (Ctrl+C).</w:t>
+      </w:r>
+      <w:r>
+        <w:rPr>
+          <w:rFonts w:ascii="Cambria Math" w:hAnsi="Cambria Math"/>
+        </w:rPr>
+        <w:t xml:space="preserve"> </w:t>
+      </w:r>
+    </w:p>
+    <w:p>
+      <w:pPr>
+        <w:rPr>
+          <w:lang w:val="en-US"/>
+        </w:rPr>
+      </w:pPr>
+    </w:p>
+    <w:p>
+      <w:pPr>
+        <w:pStyle w:val="Legenda"/>
+      </w:pPr>
+      <w:r>
+        <w:rPr>
+          <w:noProof/>
+        </w:rPr>
         <w:drawing>
           <wp:inline distT="0" distB="0" distL="0" distR="0" wp14:anchorId="6AC7BC17" wp14:editId="4680F678">
             <wp:extent cx="5760720" cy="3185160"/>
@@ -12295,45 +13840,25 @@
       <w:r>
         <w:t xml:space="preserve">Rysunek </w:t>
       </w:r>
-      <w:r>
-        <w:fldChar w:fldCharType="begin"/>
-      </w:r>
-      <w:r>
-        <w:instrText xml:space="preserve"> STYLEREF 1 \s </w:instrText>
-      </w:r>
-      <w:r>
-        <w:fldChar w:fldCharType="separate"/>
-      </w:r>
-      <w:r>
-        <w:rPr>
-          <w:noProof/>
-        </w:rPr>
-        <w:t>4</w:t>
-      </w:r>
-      <w:r>
-        <w:fldChar w:fldCharType="end"/>
-      </w:r>
+      <w:fldSimple w:instr=" STYLEREF 1 \s ">
+        <w:r>
+          <w:rPr>
+            <w:noProof/>
+          </w:rPr>
+          <w:t>4</w:t>
+        </w:r>
+      </w:fldSimple>
       <w:r>
         <w:noBreakHyphen/>
       </w:r>
-      <w:r>
-        <w:fldChar w:fldCharType="begin"/>
-      </w:r>
-      <w:r>
-        <w:instrText xml:space="preserve"> SEQ Rysunek \* ARABIC \s 1 </w:instrText>
-      </w:r>
-      <w:r>
-        <w:fldChar w:fldCharType="separate"/>
-      </w:r>
-      <w:r>
-        <w:rPr>
-          <w:noProof/>
-        </w:rPr>
-        <w:t>3</w:t>
-      </w:r>
-      <w:r>
-        <w:fldChar w:fldCharType="end"/>
-      </w:r>
+      <w:fldSimple w:instr=" SEQ Rysunek \* ARABIC \s 1 ">
+        <w:r>
+          <w:rPr>
+            <w:noProof/>
+          </w:rPr>
+          <w:t>3</w:t>
+        </w:r>
+      </w:fldSimple>
     </w:p>
     <w:p>
       <w:pPr>
@@ -12387,7 +13912,16 @@
           <w:sz w:val="24"/>
           <w:szCs w:val="24"/>
         </w:rPr>
-        <w:t>Do klasyfikacji segmentów EKG zastosowano jednowymiarową konwolucyjną sieć resztkową (1D ResNet). Sieci konwolucyjne 1D są szczególnie dobrze przystosowane do analizy szeregów czasowych, ponieważ filtry konwolucyjne uczone są bezpośrednio na surowym sygnale, wydobywając lokalne wzorce morfologiczne (kształt załamka R, nachylenie odcinka ST) bez konieczności ręcznej inżynierii cech [</w:t>
+        <w:t xml:space="preserve">Do klasyfikacji segmentów EKG zastosowano jednowymiarową konwolucyjną sieć resztkową (1D ResNet). Sieci konwolucyjne 1D są szczególnie dobrze przystosowane do analizy </w:t>
+      </w:r>
+      <w:r>
+        <w:rPr>
+          <w:rFonts w:ascii="Times New Roman" w:hAnsi="Times New Roman" w:cs="Times New Roman"/>
+          <w:sz w:val="24"/>
+          <w:szCs w:val="24"/>
+        </w:rPr>
+        <w:lastRenderedPageBreak/>
+        <w:t>szeregów czasowych, ponieważ filtry konwolucyjne uczone są bezpośrednio na surowym sygnale, wydobywając lokalne wzorce morfologiczne (kształt załamka R, nachylenie odcinka ST) bez konieczności ręcznej inżynierii cech [</w:t>
       </w:r>
       <w:r>
         <w:rPr>
@@ -12492,7 +14026,6 @@
           <w:sz w:val="24"/>
           <w:szCs w:val="24"/>
         </w:rPr>
-        <w:lastRenderedPageBreak/>
         <w:t>Warstwa wstępna. Konwolucja 1D z kernelem rozmiaru 7 i 32 filtrami projektuje surowy sygnał do przestrzeni cech o  wyższej wymiarowości. Duży kernel pozwala na uchwycenie szerszego kontekstu morfologicznego już na pierwszej warstwie.</w:t>
       </w:r>
     </w:p>
@@ -12709,6 +14242,7 @@
           <w:sz w:val="24"/>
           <w:szCs w:val="24"/>
         </w:rPr>
+        <w:lastRenderedPageBreak/>
         <w:t>GlobalAveragePooling1D. Zastąpienie operacji Flatten uśrednianiem globalnym redukuje liczbę parametrów głowy klasyfikacyjnej i działa jako regularyzator, zmniejszając ryzyko przeuczenia. Wynikiem jest wektor 256-wymiarowy,  niezależnie od długości sekwencji.</w:t>
       </w:r>
     </w:p>
@@ -12772,7 +14306,6 @@
       </w:pPr>
       <w:bookmarkStart w:id="35" w:name="_Toc229263557"/>
       <w:r>
-        <w:lastRenderedPageBreak/>
         <w:t>Proces trenowania</w:t>
       </w:r>
       <w:r>
@@ -13053,7 +14586,16 @@
           <w:sz w:val="24"/>
           <w:szCs w:val="24"/>
         </w:rPr>
-        <w:t>EarlyStopping (cierpliwość = 12 epok), przerywa trening, gdy strata walidacyjna nie poprawia się przez 12 kolejnych epok, i przywraca wagi odpowiadające najlepszej epoce. Mechanizm chroni przed przetrenowaniem przy jednoczesnym  pełnym wykorzystaniu pojemności modelu.</w:t>
+        <w:t xml:space="preserve">EarlyStopping (cierpliwość = 12 epok), przerywa trening, gdy strata walidacyjna nie poprawia się przez 12 kolejnych epok, i przywraca wagi odpowiadające najlepszej </w:t>
+      </w:r>
+      <w:r>
+        <w:rPr>
+          <w:rFonts w:ascii="Times New Roman" w:hAnsi="Times New Roman" w:cs="Times New Roman"/>
+          <w:sz w:val="24"/>
+          <w:szCs w:val="24"/>
+        </w:rPr>
+        <w:lastRenderedPageBreak/>
+        <w:t>epoce. Mechanizm chroni przed przetrenowaniem przy jednoczesnym  pełnym wykorzystaniu pojemności modelu.</w:t>
       </w:r>
     </w:p>
     <w:p>
@@ -13139,7 +14681,6 @@
           <w:sz w:val="24"/>
           <w:szCs w:val="24"/>
         </w:rPr>
-        <w:lastRenderedPageBreak/>
         <w:t>Po zakończeniu treningu model ewaluowany jest na zbiorze DS2</w:t>
       </w:r>
       <w:r>
@@ -13299,8 +14840,9 @@
         <w:rPr>
           <w:noProof/>
         </w:rPr>
+        <w:lastRenderedPageBreak/>
         <w:drawing>
-          <wp:inline distT="0" distB="0" distL="0" distR="0" wp14:anchorId="635A1885" wp14:editId="5377A9F0">
+          <wp:inline distT="0" distB="0" distL="0" distR="0" wp14:anchorId="635A1885" wp14:editId="5B4070F1">
             <wp:extent cx="3988013" cy="3418297"/>
             <wp:effectExtent l="0" t="0" r="0" b="0"/>
             <wp:docPr id="819872529" name="Obraz 1"/>
@@ -13416,7 +14958,6 @@
       </w:pPr>
       <w:bookmarkStart w:id="37" w:name="_Toc229263559"/>
       <w:r>
-        <w:lastRenderedPageBreak/>
         <w:t>Podsumowanie i wnioski</w:t>
       </w:r>
       <w:bookmarkEnd w:id="37"/>
@@ -13554,6 +15095,7 @@
           <w:szCs w:val="24"/>
           <w:lang w:val="en-US" w:eastAsia="pl-PL"/>
         </w:rPr>
+        <w:lastRenderedPageBreak/>
         <w:t>[2]</w:t>
       </w:r>
       <w:r>
@@ -14170,17 +15712,7 @@
           <w:lang w:val="en-US" w:eastAsia="pl-PL"/>
         </w:rPr>
         <w:softHyphen/>
-        <w:t xml:space="preserve">Latin American Heart Rhythm Society (LAHRS) Expert Consensus on Risk Assessment in Cardiac Arrhythmias: Use the Right </w:t>
-      </w:r>
-      <w:r>
-        <w:rPr>
-          <w:rFonts w:ascii="Times New Roman" w:hAnsi="Times New Roman" w:cs="Times New Roman"/>
-          <w:sz w:val="24"/>
-          <w:szCs w:val="24"/>
-          <w:lang w:val="en-US" w:eastAsia="pl-PL"/>
-        </w:rPr>
-        <w:lastRenderedPageBreak/>
-        <w:t>Tool for the Right Outcome, in the Right Population.</w:t>
+        <w:t>Latin American Heart Rhythm Society (LAHRS) Expert Consensus on Risk Assessment in Cardiac Arrhythmias: Use the Right Tool for the Right Outcome, in the Right Population.</w:t>
       </w:r>
       <w:r>
         <w:rPr>
@@ -14240,7 +15772,17 @@
           <w:szCs w:val="24"/>
           <w:lang w:val="en-US" w:eastAsia="pl-PL"/>
         </w:rPr>
-        <w:t>Recommendations for the Standardization and Interpretation of the Electrocardiogram: Part I: The Electrocardiogram and Its Technology a Scientific Statement From the American Heart Association Electrocardiography and Arrhythmias Committee, Council on Clinical Cardiology; The American College of Cardiology Foundation; And the Heart Rhythm Society Endorsed by the International Society for Computerized Electrocardiology.</w:t>
+        <w:t xml:space="preserve">Recommendations for the Standardization and Interpretation of the Electrocardiogram: Part I: The Electrocardiogram and Its Technology a Scientific Statement From the American Heart Association Electrocardiography and Arrhythmias Committee, Council on Clinical Cardiology; The American College of Cardiology Foundation; And the Heart Rhythm Society Endorsed by the International Society for Computerized </w:t>
+      </w:r>
+      <w:r>
+        <w:rPr>
+          <w:rFonts w:ascii="Times New Roman" w:hAnsi="Times New Roman" w:cs="Times New Roman"/>
+          <w:sz w:val="24"/>
+          <w:szCs w:val="24"/>
+          <w:lang w:val="en-US" w:eastAsia="pl-PL"/>
+        </w:rPr>
+        <w:lastRenderedPageBreak/>
+        <w:t>Electrocardiology.</w:t>
       </w:r>
       <w:r>
         <w:rPr>
@@ -14974,7 +16516,6 @@
           <w:rFonts w:ascii="Times New Roman" w:hAnsi="Times New Roman" w:cs="Times New Roman"/>
           <w:lang w:val="en-GB"/>
         </w:rPr>
-        <w:lastRenderedPageBreak/>
         <w:t xml:space="preserve">MDPI (2024/2025): </w:t>
       </w:r>
       <w:r>
@@ -15067,6 +16608,7 @@
       </w:pPr>
       <w:bookmarkStart w:id="39" w:name="_Toc229263561"/>
       <w:r>
+        <w:lastRenderedPageBreak/>
         <w:t xml:space="preserve">Spis </w:t>
       </w:r>
       <w:r>
@@ -16210,7 +17752,7 @@
       <w:lvlText w:val="%1.%2"/>
       <w:lvlJc w:val="left"/>
       <w:pPr>
-        <w:ind w:left="2419" w:hanging="576"/>
+        <w:ind w:left="2560" w:hanging="576"/>
       </w:pPr>
     </w:lvl>
     <w:lvl w:ilvl="2">
@@ -16374,6 +17916,92 @@
     </w:lvl>
   </w:abstractNum>
   <w:abstractNum w:abstractNumId="4" w15:restartNumberingAfterBreak="0">
+    <w:nsid w:val="21C40B7E"/>
+    <w:multiLevelType w:val="hybridMultilevel"/>
+    <w:tmpl w:val="0116E088"/>
+    <w:lvl w:ilvl="0" w:tplc="04150011">
+      <w:start w:val="1"/>
+      <w:numFmt w:val="decimal"/>
+      <w:lvlText w:val="%1)"/>
+      <w:lvlJc w:val="left"/>
+      <w:pPr>
+        <w:ind w:left="720" w:hanging="360"/>
+      </w:pPr>
+    </w:lvl>
+    <w:lvl w:ilvl="1" w:tplc="04150019" w:tentative="1">
+      <w:start w:val="1"/>
+      <w:numFmt w:val="lowerLetter"/>
+      <w:lvlText w:val="%2."/>
+      <w:lvlJc w:val="left"/>
+      <w:pPr>
+        <w:ind w:left="1440" w:hanging="360"/>
+      </w:pPr>
+    </w:lvl>
+    <w:lvl w:ilvl="2" w:tplc="0415001B">
+      <w:start w:val="1"/>
+      <w:numFmt w:val="lowerRoman"/>
+      <w:lvlText w:val="%3."/>
+      <w:lvlJc w:val="right"/>
+      <w:pPr>
+        <w:ind w:left="2160" w:hanging="180"/>
+      </w:pPr>
+    </w:lvl>
+    <w:lvl w:ilvl="3" w:tplc="0415000F" w:tentative="1">
+      <w:start w:val="1"/>
+      <w:numFmt w:val="decimal"/>
+      <w:lvlText w:val="%4."/>
+      <w:lvlJc w:val="left"/>
+      <w:pPr>
+        <w:ind w:left="2880" w:hanging="360"/>
+      </w:pPr>
+    </w:lvl>
+    <w:lvl w:ilvl="4" w:tplc="04150019" w:tentative="1">
+      <w:start w:val="1"/>
+      <w:numFmt w:val="lowerLetter"/>
+      <w:lvlText w:val="%5."/>
+      <w:lvlJc w:val="left"/>
+      <w:pPr>
+        <w:ind w:left="3600" w:hanging="360"/>
+      </w:pPr>
+    </w:lvl>
+    <w:lvl w:ilvl="5" w:tplc="0415001B" w:tentative="1">
+      <w:start w:val="1"/>
+      <w:numFmt w:val="lowerRoman"/>
+      <w:lvlText w:val="%6."/>
+      <w:lvlJc w:val="right"/>
+      <w:pPr>
+        <w:ind w:left="4320" w:hanging="180"/>
+      </w:pPr>
+    </w:lvl>
+    <w:lvl w:ilvl="6" w:tplc="0415000F" w:tentative="1">
+      <w:start w:val="1"/>
+      <w:numFmt w:val="decimal"/>
+      <w:lvlText w:val="%7."/>
+      <w:lvlJc w:val="left"/>
+      <w:pPr>
+        <w:ind w:left="5040" w:hanging="360"/>
+      </w:pPr>
+    </w:lvl>
+    <w:lvl w:ilvl="7" w:tplc="04150019" w:tentative="1">
+      <w:start w:val="1"/>
+      <w:numFmt w:val="lowerLetter"/>
+      <w:lvlText w:val="%8."/>
+      <w:lvlJc w:val="left"/>
+      <w:pPr>
+        <w:ind w:left="5760" w:hanging="360"/>
+      </w:pPr>
+    </w:lvl>
+    <w:lvl w:ilvl="8" w:tplc="0415001B" w:tentative="1">
+      <w:start w:val="1"/>
+      <w:numFmt w:val="lowerRoman"/>
+      <w:lvlText w:val="%9."/>
+      <w:lvlJc w:val="right"/>
+      <w:pPr>
+        <w:ind w:left="6480" w:hanging="180"/>
+      </w:pPr>
+    </w:lvl>
+  </w:abstractNum>
+  <w:abstractNum w:abstractNumId="5" w15:restartNumberingAfterBreak="0">
     <w:nsid w:val="22612171"/>
     <w:multiLevelType w:val="multilevel"/>
     <w:tmpl w:val="443286D4"/>
@@ -16522,7 +18150,7 @@
       </w:rPr>
     </w:lvl>
   </w:abstractNum>
-  <w:abstractNum w:abstractNumId="5" w15:restartNumberingAfterBreak="0">
+  <w:abstractNum w:abstractNumId="6" w15:restartNumberingAfterBreak="0">
     <w:nsid w:val="287F417E"/>
     <w:multiLevelType w:val="hybridMultilevel"/>
     <w:tmpl w:val="A0C079D8"/>
@@ -16635,7 +18263,7 @@
       </w:rPr>
     </w:lvl>
   </w:abstractNum>
-  <w:abstractNum w:abstractNumId="6" w15:restartNumberingAfterBreak="0">
+  <w:abstractNum w:abstractNumId="7" w15:restartNumberingAfterBreak="0">
     <w:nsid w:val="2D375910"/>
     <w:multiLevelType w:val="hybridMultilevel"/>
     <w:tmpl w:val="E4CE3090"/>
@@ -16721,10 +18349,209 @@
       </w:pPr>
     </w:lvl>
   </w:abstractNum>
-  <w:abstractNum w:abstractNumId="7" w15:restartNumberingAfterBreak="0">
+  <w:abstractNum w:abstractNumId="8" w15:restartNumberingAfterBreak="0">
+    <w:nsid w:val="37BC6BDD"/>
+    <w:multiLevelType w:val="hybridMultilevel"/>
+    <w:tmpl w:val="51B4EA92"/>
+    <w:lvl w:ilvl="0" w:tplc="FFFFFFFF">
+      <w:start w:val="1"/>
+      <w:numFmt w:val="decimal"/>
+      <w:lvlText w:val="%1)"/>
+      <w:lvlJc w:val="left"/>
+      <w:pPr>
+        <w:ind w:left="720" w:hanging="360"/>
+      </w:pPr>
+    </w:lvl>
+    <w:lvl w:ilvl="1" w:tplc="FFFFFFFF" w:tentative="1">
+      <w:start w:val="1"/>
+      <w:numFmt w:val="lowerLetter"/>
+      <w:lvlText w:val="%2."/>
+      <w:lvlJc w:val="left"/>
+      <w:pPr>
+        <w:ind w:left="1440" w:hanging="360"/>
+      </w:pPr>
+    </w:lvl>
+    <w:lvl w:ilvl="2" w:tplc="04150011">
+      <w:start w:val="1"/>
+      <w:numFmt w:val="decimal"/>
+      <w:lvlText w:val="%3)"/>
+      <w:lvlJc w:val="left"/>
+      <w:pPr>
+        <w:ind w:left="2340" w:hanging="360"/>
+      </w:pPr>
+    </w:lvl>
+    <w:lvl w:ilvl="3" w:tplc="FFFFFFFF" w:tentative="1">
+      <w:start w:val="1"/>
+      <w:numFmt w:val="decimal"/>
+      <w:lvlText w:val="%4."/>
+      <w:lvlJc w:val="left"/>
+      <w:pPr>
+        <w:ind w:left="2880" w:hanging="360"/>
+      </w:pPr>
+    </w:lvl>
+    <w:lvl w:ilvl="4" w:tplc="FFFFFFFF" w:tentative="1">
+      <w:start w:val="1"/>
+      <w:numFmt w:val="lowerLetter"/>
+      <w:lvlText w:val="%5."/>
+      <w:lvlJc w:val="left"/>
+      <w:pPr>
+        <w:ind w:left="3600" w:hanging="360"/>
+      </w:pPr>
+    </w:lvl>
+    <w:lvl w:ilvl="5" w:tplc="FFFFFFFF" w:tentative="1">
+      <w:start w:val="1"/>
+      <w:numFmt w:val="lowerRoman"/>
+      <w:lvlText w:val="%6."/>
+      <w:lvlJc w:val="right"/>
+      <w:pPr>
+        <w:ind w:left="4320" w:hanging="180"/>
+      </w:pPr>
+    </w:lvl>
+    <w:lvl w:ilvl="6" w:tplc="FFFFFFFF" w:tentative="1">
+      <w:start w:val="1"/>
+      <w:numFmt w:val="decimal"/>
+      <w:lvlText w:val="%7."/>
+      <w:lvlJc w:val="left"/>
+      <w:pPr>
+        <w:ind w:left="5040" w:hanging="360"/>
+      </w:pPr>
+    </w:lvl>
+    <w:lvl w:ilvl="7" w:tplc="FFFFFFFF" w:tentative="1">
+      <w:start w:val="1"/>
+      <w:numFmt w:val="lowerLetter"/>
+      <w:lvlText w:val="%8."/>
+      <w:lvlJc w:val="left"/>
+      <w:pPr>
+        <w:ind w:left="5760" w:hanging="360"/>
+      </w:pPr>
+    </w:lvl>
+    <w:lvl w:ilvl="8" w:tplc="FFFFFFFF" w:tentative="1">
+      <w:start w:val="1"/>
+      <w:numFmt w:val="lowerRoman"/>
+      <w:lvlText w:val="%9."/>
+      <w:lvlJc w:val="right"/>
+      <w:pPr>
+        <w:ind w:left="6480" w:hanging="180"/>
+      </w:pPr>
+    </w:lvl>
+  </w:abstractNum>
+  <w:abstractNum w:abstractNumId="9" w15:restartNumberingAfterBreak="0">
+    <w:nsid w:val="3B7E14D8"/>
+    <w:multiLevelType w:val="hybridMultilevel"/>
+    <w:tmpl w:val="92DED360"/>
+    <w:lvl w:ilvl="0" w:tplc="E6A28B00">
+      <w:start w:val="1"/>
+      <w:numFmt w:val="bullet"/>
+      <w:lvlText w:val=""/>
+      <w:lvlJc w:val="left"/>
+      <w:pPr>
+        <w:ind w:left="720" w:hanging="360"/>
+      </w:pPr>
+      <w:rPr>
+        <w:rFonts w:ascii="Symbol" w:hAnsi="Symbol" w:hint="default"/>
+      </w:rPr>
+    </w:lvl>
+    <w:lvl w:ilvl="1" w:tplc="04150003" w:tentative="1">
+      <w:start w:val="1"/>
+      <w:numFmt w:val="bullet"/>
+      <w:lvlText w:val="o"/>
+      <w:lvlJc w:val="left"/>
+      <w:pPr>
+        <w:ind w:left="1440" w:hanging="360"/>
+      </w:pPr>
+      <w:rPr>
+        <w:rFonts w:ascii="Courier New" w:hAnsi="Courier New" w:cs="Courier New" w:hint="default"/>
+      </w:rPr>
+    </w:lvl>
+    <w:lvl w:ilvl="2" w:tplc="04150005" w:tentative="1">
+      <w:start w:val="1"/>
+      <w:numFmt w:val="bullet"/>
+      <w:lvlText w:val=""/>
+      <w:lvlJc w:val="left"/>
+      <w:pPr>
+        <w:ind w:left="2160" w:hanging="360"/>
+      </w:pPr>
+      <w:rPr>
+        <w:rFonts w:ascii="Wingdings" w:hAnsi="Wingdings" w:hint="default"/>
+      </w:rPr>
+    </w:lvl>
+    <w:lvl w:ilvl="3" w:tplc="04150001" w:tentative="1">
+      <w:start w:val="1"/>
+      <w:numFmt w:val="bullet"/>
+      <w:lvlText w:val=""/>
+      <w:lvlJc w:val="left"/>
+      <w:pPr>
+        <w:ind w:left="2880" w:hanging="360"/>
+      </w:pPr>
+      <w:rPr>
+        <w:rFonts w:ascii="Symbol" w:hAnsi="Symbol" w:hint="default"/>
+      </w:rPr>
+    </w:lvl>
+    <w:lvl w:ilvl="4" w:tplc="04150003" w:tentative="1">
+      <w:start w:val="1"/>
+      <w:numFmt w:val="bullet"/>
+      <w:lvlText w:val="o"/>
+      <w:lvlJc w:val="left"/>
+      <w:pPr>
+        <w:ind w:left="3600" w:hanging="360"/>
+      </w:pPr>
+      <w:rPr>
+        <w:rFonts w:ascii="Courier New" w:hAnsi="Courier New" w:cs="Courier New" w:hint="default"/>
+      </w:rPr>
+    </w:lvl>
+    <w:lvl w:ilvl="5" w:tplc="04150005" w:tentative="1">
+      <w:start w:val="1"/>
+      <w:numFmt w:val="bullet"/>
+      <w:lvlText w:val=""/>
+      <w:lvlJc w:val="left"/>
+      <w:pPr>
+        <w:ind w:left="4320" w:hanging="360"/>
+      </w:pPr>
+      <w:rPr>
+        <w:rFonts w:ascii="Wingdings" w:hAnsi="Wingdings" w:hint="default"/>
+      </w:rPr>
+    </w:lvl>
+    <w:lvl w:ilvl="6" w:tplc="04150001" w:tentative="1">
+      <w:start w:val="1"/>
+      <w:numFmt w:val="bullet"/>
+      <w:lvlText w:val=""/>
+      <w:lvlJc w:val="left"/>
+      <w:pPr>
+        <w:ind w:left="5040" w:hanging="360"/>
+      </w:pPr>
+      <w:rPr>
+        <w:rFonts w:ascii="Symbol" w:hAnsi="Symbol" w:hint="default"/>
+      </w:rPr>
+    </w:lvl>
+    <w:lvl w:ilvl="7" w:tplc="04150003" w:tentative="1">
+      <w:start w:val="1"/>
+      <w:numFmt w:val="bullet"/>
+      <w:lvlText w:val="o"/>
+      <w:lvlJc w:val="left"/>
+      <w:pPr>
+        <w:ind w:left="5760" w:hanging="360"/>
+      </w:pPr>
+      <w:rPr>
+        <w:rFonts w:ascii="Courier New" w:hAnsi="Courier New" w:cs="Courier New" w:hint="default"/>
+      </w:rPr>
+    </w:lvl>
+    <w:lvl w:ilvl="8" w:tplc="04150005" w:tentative="1">
+      <w:start w:val="1"/>
+      <w:numFmt w:val="bullet"/>
+      <w:lvlText w:val=""/>
+      <w:lvlJc w:val="left"/>
+      <w:pPr>
+        <w:ind w:left="6480" w:hanging="360"/>
+      </w:pPr>
+      <w:rPr>
+        <w:rFonts w:ascii="Wingdings" w:hAnsi="Wingdings" w:hint="default"/>
+      </w:rPr>
+    </w:lvl>
+  </w:abstractNum>
+  <w:abstractNum w:abstractNumId="10" w15:restartNumberingAfterBreak="0">
     <w:nsid w:val="4914459B"/>
     <w:multiLevelType w:val="multilevel"/>
-    <w:tmpl w:val="5C827316"/>
+    <w:tmpl w:val="646889D2"/>
     <w:lvl w:ilvl="0">
       <w:start w:val="1"/>
       <w:numFmt w:val="bullet"/>
@@ -16757,6 +18584,151 @@
         <w:sz w:val="20"/>
       </w:rPr>
     </w:lvl>
+    <w:lvl w:ilvl="2">
+      <w:start w:val="1"/>
+      <w:numFmt w:val="decimal"/>
+      <w:lvlText w:val="%3."/>
+      <w:lvlJc w:val="left"/>
+      <w:pPr>
+        <w:ind w:left="2160" w:hanging="360"/>
+      </w:pPr>
+      <w:rPr>
+        <w:rFonts w:hint="default"/>
+      </w:rPr>
+    </w:lvl>
+    <w:lvl w:ilvl="3" w:tentative="1">
+      <w:start w:val="1"/>
+      <w:numFmt w:val="bullet"/>
+      <w:lvlText w:val=""/>
+      <w:lvlJc w:val="left"/>
+      <w:pPr>
+        <w:tabs>
+          <w:tab w:val="num" w:pos="2880"/>
+        </w:tabs>
+        <w:ind w:left="2880" w:hanging="360"/>
+      </w:pPr>
+      <w:rPr>
+        <w:rFonts w:ascii="Wingdings" w:hAnsi="Wingdings" w:hint="default"/>
+        <w:sz w:val="20"/>
+      </w:rPr>
+    </w:lvl>
+    <w:lvl w:ilvl="4" w:tentative="1">
+      <w:start w:val="1"/>
+      <w:numFmt w:val="bullet"/>
+      <w:lvlText w:val=""/>
+      <w:lvlJc w:val="left"/>
+      <w:pPr>
+        <w:tabs>
+          <w:tab w:val="num" w:pos="3600"/>
+        </w:tabs>
+        <w:ind w:left="3600" w:hanging="360"/>
+      </w:pPr>
+      <w:rPr>
+        <w:rFonts w:ascii="Wingdings" w:hAnsi="Wingdings" w:hint="default"/>
+        <w:sz w:val="20"/>
+      </w:rPr>
+    </w:lvl>
+    <w:lvl w:ilvl="5" w:tentative="1">
+      <w:start w:val="1"/>
+      <w:numFmt w:val="bullet"/>
+      <w:lvlText w:val=""/>
+      <w:lvlJc w:val="left"/>
+      <w:pPr>
+        <w:tabs>
+          <w:tab w:val="num" w:pos="4320"/>
+        </w:tabs>
+        <w:ind w:left="4320" w:hanging="360"/>
+      </w:pPr>
+      <w:rPr>
+        <w:rFonts w:ascii="Wingdings" w:hAnsi="Wingdings" w:hint="default"/>
+        <w:sz w:val="20"/>
+      </w:rPr>
+    </w:lvl>
+    <w:lvl w:ilvl="6" w:tentative="1">
+      <w:start w:val="1"/>
+      <w:numFmt w:val="bullet"/>
+      <w:lvlText w:val=""/>
+      <w:lvlJc w:val="left"/>
+      <w:pPr>
+        <w:tabs>
+          <w:tab w:val="num" w:pos="5040"/>
+        </w:tabs>
+        <w:ind w:left="5040" w:hanging="360"/>
+      </w:pPr>
+      <w:rPr>
+        <w:rFonts w:ascii="Wingdings" w:hAnsi="Wingdings" w:hint="default"/>
+        <w:sz w:val="20"/>
+      </w:rPr>
+    </w:lvl>
+    <w:lvl w:ilvl="7" w:tentative="1">
+      <w:start w:val="1"/>
+      <w:numFmt w:val="bullet"/>
+      <w:lvlText w:val=""/>
+      <w:lvlJc w:val="left"/>
+      <w:pPr>
+        <w:tabs>
+          <w:tab w:val="num" w:pos="5760"/>
+        </w:tabs>
+        <w:ind w:left="5760" w:hanging="360"/>
+      </w:pPr>
+      <w:rPr>
+        <w:rFonts w:ascii="Wingdings" w:hAnsi="Wingdings" w:hint="default"/>
+        <w:sz w:val="20"/>
+      </w:rPr>
+    </w:lvl>
+    <w:lvl w:ilvl="8" w:tentative="1">
+      <w:start w:val="1"/>
+      <w:numFmt w:val="bullet"/>
+      <w:lvlText w:val=""/>
+      <w:lvlJc w:val="left"/>
+      <w:pPr>
+        <w:tabs>
+          <w:tab w:val="num" w:pos="6480"/>
+        </w:tabs>
+        <w:ind w:left="6480" w:hanging="360"/>
+      </w:pPr>
+      <w:rPr>
+        <w:rFonts w:ascii="Wingdings" w:hAnsi="Wingdings" w:hint="default"/>
+        <w:sz w:val="20"/>
+      </w:rPr>
+    </w:lvl>
+  </w:abstractNum>
+  <w:abstractNum w:abstractNumId="11" w15:restartNumberingAfterBreak="0">
+    <w:nsid w:val="4E4B6620"/>
+    <w:multiLevelType w:val="multilevel"/>
+    <w:tmpl w:val="5C827316"/>
+    <w:lvl w:ilvl="0">
+      <w:start w:val="1"/>
+      <w:numFmt w:val="bullet"/>
+      <w:lvlText w:val=""/>
+      <w:lvlJc w:val="left"/>
+      <w:pPr>
+        <w:tabs>
+          <w:tab w:val="num" w:pos="720"/>
+        </w:tabs>
+        <w:ind w:left="720" w:hanging="360"/>
+      </w:pPr>
+      <w:rPr>
+        <w:rFonts w:ascii="Symbol" w:hAnsi="Symbol" w:hint="default"/>
+        <w:sz w:val="20"/>
+      </w:rPr>
+    </w:lvl>
+    <w:lvl w:ilvl="1" w:tentative="1">
+      <w:start w:val="1"/>
+      <w:numFmt w:val="bullet"/>
+      <w:lvlText w:val="o"/>
+      <w:lvlJc w:val="left"/>
+      <w:pPr>
+        <w:tabs>
+          <w:tab w:val="num" w:pos="1440"/>
+        </w:tabs>
+        <w:ind w:left="1440" w:hanging="360"/>
+      </w:pPr>
+      <w:rPr>
+        <w:rFonts w:ascii="Courier New" w:hAnsi="Courier New" w:hint="default"/>
+        <w:sz w:val="20"/>
+      </w:rPr>
+    </w:lvl>
     <w:lvl w:ilvl="2" w:tentative="1">
       <w:start w:val="1"/>
       <w:numFmt w:val="bullet"/>
@@ -16870,159 +18842,10 @@
       </w:rPr>
     </w:lvl>
   </w:abstractNum>
-  <w:abstractNum w:abstractNumId="8" w15:restartNumberingAfterBreak="0">
-    <w:nsid w:val="4E4B6620"/>
-    <w:multiLevelType w:val="multilevel"/>
-    <w:tmpl w:val="5C827316"/>
-    <w:lvl w:ilvl="0">
-      <w:start w:val="1"/>
-      <w:numFmt w:val="bullet"/>
-      <w:lvlText w:val=""/>
-      <w:lvlJc w:val="left"/>
-      <w:pPr>
-        <w:tabs>
-          <w:tab w:val="num" w:pos="720"/>
-        </w:tabs>
-        <w:ind w:left="720" w:hanging="360"/>
-      </w:pPr>
-      <w:rPr>
-        <w:rFonts w:ascii="Symbol" w:hAnsi="Symbol" w:hint="default"/>
-        <w:sz w:val="20"/>
-      </w:rPr>
-    </w:lvl>
-    <w:lvl w:ilvl="1" w:tentative="1">
-      <w:start w:val="1"/>
-      <w:numFmt w:val="bullet"/>
-      <w:lvlText w:val="o"/>
-      <w:lvlJc w:val="left"/>
-      <w:pPr>
-        <w:tabs>
-          <w:tab w:val="num" w:pos="1440"/>
-        </w:tabs>
-        <w:ind w:left="1440" w:hanging="360"/>
-      </w:pPr>
-      <w:rPr>
-        <w:rFonts w:ascii="Courier New" w:hAnsi="Courier New" w:hint="default"/>
-        <w:sz w:val="20"/>
-      </w:rPr>
-    </w:lvl>
-    <w:lvl w:ilvl="2" w:tentative="1">
-      <w:start w:val="1"/>
-      <w:numFmt w:val="bullet"/>
-      <w:lvlText w:val=""/>
-      <w:lvlJc w:val="left"/>
-      <w:pPr>
-        <w:tabs>
-          <w:tab w:val="num" w:pos="2160"/>
-        </w:tabs>
-        <w:ind w:left="2160" w:hanging="360"/>
-      </w:pPr>
-      <w:rPr>
-        <w:rFonts w:ascii="Wingdings" w:hAnsi="Wingdings" w:hint="default"/>
-        <w:sz w:val="20"/>
-      </w:rPr>
-    </w:lvl>
-    <w:lvl w:ilvl="3" w:tentative="1">
-      <w:start w:val="1"/>
-      <w:numFmt w:val="bullet"/>
-      <w:lvlText w:val=""/>
-      <w:lvlJc w:val="left"/>
-      <w:pPr>
-        <w:tabs>
-          <w:tab w:val="num" w:pos="2880"/>
-        </w:tabs>
-        <w:ind w:left="2880" w:hanging="360"/>
-      </w:pPr>
-      <w:rPr>
-        <w:rFonts w:ascii="Wingdings" w:hAnsi="Wingdings" w:hint="default"/>
-        <w:sz w:val="20"/>
-      </w:rPr>
-    </w:lvl>
-    <w:lvl w:ilvl="4" w:tentative="1">
-      <w:start w:val="1"/>
-      <w:numFmt w:val="bullet"/>
-      <w:lvlText w:val=""/>
-      <w:lvlJc w:val="left"/>
-      <w:pPr>
-        <w:tabs>
-          <w:tab w:val="num" w:pos="3600"/>
-        </w:tabs>
-        <w:ind w:left="3600" w:hanging="360"/>
-      </w:pPr>
-      <w:rPr>
-        <w:rFonts w:ascii="Wingdings" w:hAnsi="Wingdings" w:hint="default"/>
-        <w:sz w:val="20"/>
-      </w:rPr>
-    </w:lvl>
-    <w:lvl w:ilvl="5" w:tentative="1">
-      <w:start w:val="1"/>
-      <w:numFmt w:val="bullet"/>
-      <w:lvlText w:val=""/>
-      <w:lvlJc w:val="left"/>
-      <w:pPr>
-        <w:tabs>
-          <w:tab w:val="num" w:pos="4320"/>
-        </w:tabs>
-        <w:ind w:left="4320" w:hanging="360"/>
-      </w:pPr>
-      <w:rPr>
-        <w:rFonts w:ascii="Wingdings" w:hAnsi="Wingdings" w:hint="default"/>
-        <w:sz w:val="20"/>
-      </w:rPr>
-    </w:lvl>
-    <w:lvl w:ilvl="6" w:tentative="1">
-      <w:start w:val="1"/>
-      <w:numFmt w:val="bullet"/>
-      <w:lvlText w:val=""/>
-      <w:lvlJc w:val="left"/>
-      <w:pPr>
-        <w:tabs>
-          <w:tab w:val="num" w:pos="5040"/>
-        </w:tabs>
-        <w:ind w:left="5040" w:hanging="360"/>
-      </w:pPr>
-      <w:rPr>
-        <w:rFonts w:ascii="Wingdings" w:hAnsi="Wingdings" w:hint="default"/>
-        <w:sz w:val="20"/>
-      </w:rPr>
-    </w:lvl>
-    <w:lvl w:ilvl="7" w:tentative="1">
-      <w:start w:val="1"/>
-      <w:numFmt w:val="bullet"/>
-      <w:lvlText w:val=""/>
-      <w:lvlJc w:val="left"/>
-      <w:pPr>
-        <w:tabs>
-          <w:tab w:val="num" w:pos="5760"/>
-        </w:tabs>
-        <w:ind w:left="5760" w:hanging="360"/>
-      </w:pPr>
-      <w:rPr>
-        <w:rFonts w:ascii="Wingdings" w:hAnsi="Wingdings" w:hint="default"/>
-        <w:sz w:val="20"/>
-      </w:rPr>
-    </w:lvl>
-    <w:lvl w:ilvl="8" w:tentative="1">
-      <w:start w:val="1"/>
-      <w:numFmt w:val="bullet"/>
-      <w:lvlText w:val=""/>
-      <w:lvlJc w:val="left"/>
-      <w:pPr>
-        <w:tabs>
-          <w:tab w:val="num" w:pos="6480"/>
-        </w:tabs>
-        <w:ind w:left="6480" w:hanging="360"/>
-      </w:pPr>
-      <w:rPr>
-        <w:rFonts w:ascii="Wingdings" w:hAnsi="Wingdings" w:hint="default"/>
-        <w:sz w:val="20"/>
-      </w:rPr>
-    </w:lvl>
-  </w:abstractNum>
-  <w:abstractNum w:abstractNumId="9" w15:restartNumberingAfterBreak="0">
-    <w:nsid w:val="5242070A"/>
+  <w:abstractNum w:abstractNumId="12" w15:restartNumberingAfterBreak="0">
+    <w:nsid w:val="4F884B8D"/>
     <w:multiLevelType w:val="hybridMultilevel"/>
-    <w:tmpl w:val="6A60707C"/>
+    <w:tmpl w:val="4D90ED60"/>
     <w:lvl w:ilvl="0" w:tplc="E6A28B00">
       <w:start w:val="1"/>
       <w:numFmt w:val="bullet"/>
@@ -17132,10 +18955,10 @@
       </w:rPr>
     </w:lvl>
   </w:abstractNum>
-  <w:abstractNum w:abstractNumId="10" w15:restartNumberingAfterBreak="0">
-    <w:nsid w:val="537A3928"/>
+  <w:abstractNum w:abstractNumId="13" w15:restartNumberingAfterBreak="0">
+    <w:nsid w:val="5242070A"/>
     <w:multiLevelType w:val="hybridMultilevel"/>
-    <w:tmpl w:val="65BC5AA4"/>
+    <w:tmpl w:val="6A60707C"/>
     <w:lvl w:ilvl="0" w:tplc="E6A28B00">
       <w:start w:val="1"/>
       <w:numFmt w:val="bullet"/>
@@ -17245,10 +19068,10 @@
       </w:rPr>
     </w:lvl>
   </w:abstractNum>
-  <w:abstractNum w:abstractNumId="11" w15:restartNumberingAfterBreak="0">
-    <w:nsid w:val="6C3216ED"/>
+  <w:abstractNum w:abstractNumId="14" w15:restartNumberingAfterBreak="0">
+    <w:nsid w:val="537A3928"/>
     <w:multiLevelType w:val="hybridMultilevel"/>
-    <w:tmpl w:val="61F6A8EA"/>
+    <w:tmpl w:val="65BC5AA4"/>
     <w:lvl w:ilvl="0" w:tplc="E6A28B00">
       <w:start w:val="1"/>
       <w:numFmt w:val="bullet"/>
@@ -17358,7 +19181,120 @@
       </w:rPr>
     </w:lvl>
   </w:abstractNum>
-  <w:abstractNum w:abstractNumId="12" w15:restartNumberingAfterBreak="0">
+  <w:abstractNum w:abstractNumId="15" w15:restartNumberingAfterBreak="0">
+    <w:nsid w:val="6C3216ED"/>
+    <w:multiLevelType w:val="hybridMultilevel"/>
+    <w:tmpl w:val="61F6A8EA"/>
+    <w:lvl w:ilvl="0" w:tplc="E6A28B00">
+      <w:start w:val="1"/>
+      <w:numFmt w:val="bullet"/>
+      <w:lvlText w:val=""/>
+      <w:lvlJc w:val="left"/>
+      <w:pPr>
+        <w:ind w:left="720" w:hanging="360"/>
+      </w:pPr>
+      <w:rPr>
+        <w:rFonts w:ascii="Symbol" w:hAnsi="Symbol" w:hint="default"/>
+      </w:rPr>
+    </w:lvl>
+    <w:lvl w:ilvl="1" w:tplc="04150003" w:tentative="1">
+      <w:start w:val="1"/>
+      <w:numFmt w:val="bullet"/>
+      <w:lvlText w:val="o"/>
+      <w:lvlJc w:val="left"/>
+      <w:pPr>
+        <w:ind w:left="1440" w:hanging="360"/>
+      </w:pPr>
+      <w:rPr>
+        <w:rFonts w:ascii="Courier New" w:hAnsi="Courier New" w:cs="Courier New" w:hint="default"/>
+      </w:rPr>
+    </w:lvl>
+    <w:lvl w:ilvl="2" w:tplc="04150005" w:tentative="1">
+      <w:start w:val="1"/>
+      <w:numFmt w:val="bullet"/>
+      <w:lvlText w:val=""/>
+      <w:lvlJc w:val="left"/>
+      <w:pPr>
+        <w:ind w:left="2160" w:hanging="360"/>
+      </w:pPr>
+      <w:rPr>
+        <w:rFonts w:ascii="Wingdings" w:hAnsi="Wingdings" w:hint="default"/>
+      </w:rPr>
+    </w:lvl>
+    <w:lvl w:ilvl="3" w:tplc="04150001" w:tentative="1">
+      <w:start w:val="1"/>
+      <w:numFmt w:val="bullet"/>
+      <w:lvlText w:val=""/>
+      <w:lvlJc w:val="left"/>
+      <w:pPr>
+        <w:ind w:left="2880" w:hanging="360"/>
+      </w:pPr>
+      <w:rPr>
+        <w:rFonts w:ascii="Symbol" w:hAnsi="Symbol" w:hint="default"/>
+      </w:rPr>
+    </w:lvl>
+    <w:lvl w:ilvl="4" w:tplc="04150003" w:tentative="1">
+      <w:start w:val="1"/>
+      <w:numFmt w:val="bullet"/>
+      <w:lvlText w:val="o"/>
+      <w:lvlJc w:val="left"/>
+      <w:pPr>
+        <w:ind w:left="3600" w:hanging="360"/>
+      </w:pPr>
+      <w:rPr>
+        <w:rFonts w:ascii="Courier New" w:hAnsi="Courier New" w:cs="Courier New" w:hint="default"/>
+      </w:rPr>
+    </w:lvl>
+    <w:lvl w:ilvl="5" w:tplc="04150005" w:tentative="1">
+      <w:start w:val="1"/>
+      <w:numFmt w:val="bullet"/>
+      <w:lvlText w:val=""/>
+      <w:lvlJc w:val="left"/>
+      <w:pPr>
+        <w:ind w:left="4320" w:hanging="360"/>
+      </w:pPr>
+      <w:rPr>
+        <w:rFonts w:ascii="Wingdings" w:hAnsi="Wingdings" w:hint="default"/>
+      </w:rPr>
+    </w:lvl>
+    <w:lvl w:ilvl="6" w:tplc="04150001" w:tentative="1">
+      <w:start w:val="1"/>
+      <w:numFmt w:val="bullet"/>
+      <w:lvlText w:val=""/>
+      <w:lvlJc w:val="left"/>
+      <w:pPr>
+        <w:ind w:left="5040" w:hanging="360"/>
+      </w:pPr>
+      <w:rPr>
+        <w:rFonts w:ascii="Symbol" w:hAnsi="Symbol" w:hint="default"/>
+      </w:rPr>
+    </w:lvl>
+    <w:lvl w:ilvl="7" w:tplc="04150003" w:tentative="1">
+      <w:start w:val="1"/>
+      <w:numFmt w:val="bullet"/>
+      <w:lvlText w:val="o"/>
+      <w:lvlJc w:val="left"/>
+      <w:pPr>
+        <w:ind w:left="5760" w:hanging="360"/>
+      </w:pPr>
+      <w:rPr>
+        <w:rFonts w:ascii="Courier New" w:hAnsi="Courier New" w:cs="Courier New" w:hint="default"/>
+      </w:rPr>
+    </w:lvl>
+    <w:lvl w:ilvl="8" w:tplc="04150005" w:tentative="1">
+      <w:start w:val="1"/>
+      <w:numFmt w:val="bullet"/>
+      <w:lvlText w:val=""/>
+      <w:lvlJc w:val="left"/>
+      <w:pPr>
+        <w:ind w:left="6480" w:hanging="360"/>
+      </w:pPr>
+      <w:rPr>
+        <w:rFonts w:ascii="Wingdings" w:hAnsi="Wingdings" w:hint="default"/>
+      </w:rPr>
+    </w:lvl>
+  </w:abstractNum>
+  <w:abstractNum w:abstractNumId="16" w15:restartNumberingAfterBreak="0">
     <w:nsid w:val="6E49434A"/>
     <w:multiLevelType w:val="hybridMultilevel"/>
     <w:tmpl w:val="CBCC0776"/>
@@ -17447,17 +19383,103 @@
       </w:pPr>
     </w:lvl>
   </w:abstractNum>
+  <w:abstractNum w:abstractNumId="17" w15:restartNumberingAfterBreak="0">
+    <w:nsid w:val="7AA67A3B"/>
+    <w:multiLevelType w:val="hybridMultilevel"/>
+    <w:tmpl w:val="E650068C"/>
+    <w:lvl w:ilvl="0" w:tplc="04150011">
+      <w:start w:val="1"/>
+      <w:numFmt w:val="decimal"/>
+      <w:lvlText w:val="%1)"/>
+      <w:lvlJc w:val="left"/>
+      <w:pPr>
+        <w:ind w:left="720" w:hanging="360"/>
+      </w:pPr>
+    </w:lvl>
+    <w:lvl w:ilvl="1" w:tplc="04150019" w:tentative="1">
+      <w:start w:val="1"/>
+      <w:numFmt w:val="lowerLetter"/>
+      <w:lvlText w:val="%2."/>
+      <w:lvlJc w:val="left"/>
+      <w:pPr>
+        <w:ind w:left="1440" w:hanging="360"/>
+      </w:pPr>
+    </w:lvl>
+    <w:lvl w:ilvl="2" w:tplc="0415001B" w:tentative="1">
+      <w:start w:val="1"/>
+      <w:numFmt w:val="lowerRoman"/>
+      <w:lvlText w:val="%3."/>
+      <w:lvlJc w:val="right"/>
+      <w:pPr>
+        <w:ind w:left="2160" w:hanging="180"/>
+      </w:pPr>
+    </w:lvl>
+    <w:lvl w:ilvl="3" w:tplc="0415000F" w:tentative="1">
+      <w:start w:val="1"/>
+      <w:numFmt w:val="decimal"/>
+      <w:lvlText w:val="%4."/>
+      <w:lvlJc w:val="left"/>
+      <w:pPr>
+        <w:ind w:left="2880" w:hanging="360"/>
+      </w:pPr>
+    </w:lvl>
+    <w:lvl w:ilvl="4" w:tplc="04150019" w:tentative="1">
+      <w:start w:val="1"/>
+      <w:numFmt w:val="lowerLetter"/>
+      <w:lvlText w:val="%5."/>
+      <w:lvlJc w:val="left"/>
+      <w:pPr>
+        <w:ind w:left="3600" w:hanging="360"/>
+      </w:pPr>
+    </w:lvl>
+    <w:lvl w:ilvl="5" w:tplc="0415001B" w:tentative="1">
+      <w:start w:val="1"/>
+      <w:numFmt w:val="lowerRoman"/>
+      <w:lvlText w:val="%6."/>
+      <w:lvlJc w:val="right"/>
+      <w:pPr>
+        <w:ind w:left="4320" w:hanging="180"/>
+      </w:pPr>
+    </w:lvl>
+    <w:lvl w:ilvl="6" w:tplc="0415000F" w:tentative="1">
+      <w:start w:val="1"/>
+      <w:numFmt w:val="decimal"/>
+      <w:lvlText w:val="%7."/>
+      <w:lvlJc w:val="left"/>
+      <w:pPr>
+        <w:ind w:left="5040" w:hanging="360"/>
+      </w:pPr>
+    </w:lvl>
+    <w:lvl w:ilvl="7" w:tplc="04150019" w:tentative="1">
+      <w:start w:val="1"/>
+      <w:numFmt w:val="lowerLetter"/>
+      <w:lvlText w:val="%8."/>
+      <w:lvlJc w:val="left"/>
+      <w:pPr>
+        <w:ind w:left="5760" w:hanging="360"/>
+      </w:pPr>
+    </w:lvl>
+    <w:lvl w:ilvl="8" w:tplc="0415001B" w:tentative="1">
+      <w:start w:val="1"/>
+      <w:numFmt w:val="lowerRoman"/>
+      <w:lvlText w:val="%9."/>
+      <w:lvlJc w:val="right"/>
+      <w:pPr>
+        <w:ind w:left="6480" w:hanging="180"/>
+      </w:pPr>
+    </w:lvl>
+  </w:abstractNum>
   <w:num w:numId="1" w16cid:durableId="125240320">
     <w:abstractNumId w:val="2"/>
   </w:num>
   <w:num w:numId="2" w16cid:durableId="1634097248">
-    <w:abstractNumId w:val="6"/>
+    <w:abstractNumId w:val="7"/>
   </w:num>
   <w:num w:numId="3" w16cid:durableId="119693847">
-    <w:abstractNumId w:val="9"/>
+    <w:abstractNumId w:val="13"/>
   </w:num>
   <w:num w:numId="4" w16cid:durableId="1551191471">
-    <w:abstractNumId w:val="11"/>
+    <w:abstractNumId w:val="15"/>
   </w:num>
   <w:num w:numId="5" w16cid:durableId="393479294">
     <w:abstractNumId w:val="0"/>
@@ -17466,25 +19488,40 @@
     <w:abstractNumId w:val="1"/>
   </w:num>
   <w:num w:numId="7" w16cid:durableId="776026640">
-    <w:abstractNumId w:val="5"/>
+    <w:abstractNumId w:val="6"/>
   </w:num>
   <w:num w:numId="8" w16cid:durableId="1175732323">
-    <w:abstractNumId w:val="12"/>
+    <w:abstractNumId w:val="16"/>
   </w:num>
   <w:num w:numId="9" w16cid:durableId="1119182890">
     <w:abstractNumId w:val="3"/>
   </w:num>
   <w:num w:numId="10" w16cid:durableId="152187954">
+    <w:abstractNumId w:val="5"/>
+  </w:num>
+  <w:num w:numId="11" w16cid:durableId="1382292106">
+    <w:abstractNumId w:val="11"/>
+  </w:num>
+  <w:num w:numId="12" w16cid:durableId="2103716271">
+    <w:abstractNumId w:val="10"/>
+  </w:num>
+  <w:num w:numId="13" w16cid:durableId="1348210447">
+    <w:abstractNumId w:val="14"/>
+  </w:num>
+  <w:num w:numId="14" w16cid:durableId="1921789177">
+    <w:abstractNumId w:val="17"/>
+  </w:num>
+  <w:num w:numId="15" w16cid:durableId="820125132">
+    <w:abstractNumId w:val="12"/>
+  </w:num>
+  <w:num w:numId="16" w16cid:durableId="2129202888">
+    <w:abstractNumId w:val="9"/>
+  </w:num>
+  <w:num w:numId="17" w16cid:durableId="1010373353">
     <w:abstractNumId w:val="4"/>
   </w:num>
-  <w:num w:numId="11" w16cid:durableId="1382292106">
+  <w:num w:numId="18" w16cid:durableId="1431899013">
     <w:abstractNumId w:val="8"/>
-  </w:num>
-  <w:num w:numId="12" w16cid:durableId="2103716271">
-    <w:abstractNumId w:val="7"/>
-  </w:num>
-  <w:num w:numId="13" w16cid:durableId="1348210447">
-    <w:abstractNumId w:val="10"/>
   </w:num>
   <w:numIdMacAtCleanup w:val="13"/>
 </w:numbering>
@@ -18152,6 +20189,7 @@
   <w:style w:type="character" w:default="1" w:styleId="Domylnaczcionkaakapitu">
     <w:name w:val="Default Paragraph Font"/>
     <w:uiPriority w:val="1"/>
+    <w:semiHidden/>
     <w:unhideWhenUsed/>
   </w:style>
   <w:style w:type="table" w:default="1" w:styleId="Standardowy">
@@ -20343,7 +22381,12 @@
 </file>
 
 <file path=customXml/item2.xml><?xml version="1.0" encoding="utf-8"?>
-<b:Sources xmlns:b="http://schemas.openxmlformats.org/officeDocument/2006/bibliography" xmlns="http://schemas.openxmlformats.org/officeDocument/2006/bibliography" SelectedStyle="\APASixthEditionOfficeOnline.xsl" StyleName="APA" Version="6"/>
+<?mso-contentType ?>
+<FormTemplates xmlns="http://schemas.microsoft.com/sharepoint/v3/contenttype/forms">
+  <Display>DocumentLibraryForm</Display>
+  <Edit>DocumentLibraryForm</Edit>
+  <New>DocumentLibraryForm</New>
+</FormTemplates>
 </file>
 
 <file path=customXml/item3.xml><?xml version="1.0" encoding="utf-8"?>
@@ -20355,12 +22398,7 @@
 </file>
 
 <file path=customXml/item4.xml><?xml version="1.0" encoding="utf-8"?>
-<?mso-contentType ?>
-<FormTemplates xmlns="http://schemas.microsoft.com/sharepoint/v3/contenttype/forms">
-  <Display>DocumentLibraryForm</Display>
-  <Edit>DocumentLibraryForm</Edit>
-  <New>DocumentLibraryForm</New>
-</FormTemplates>
+<b:Sources xmlns:b="http://schemas.openxmlformats.org/officeDocument/2006/bibliography" xmlns="http://schemas.openxmlformats.org/officeDocument/2006/bibliography" SelectedStyle="\APASixthEditionOfficeOnline.xsl" StyleName="APA" Version="6"/>
 </file>
 
 <file path=customXml/itemProps1.xml><?xml version="1.0" encoding="utf-8"?>
@@ -20382,9 +22420,9 @@
 </file>
 
 <file path=customXml/itemProps2.xml><?xml version="1.0" encoding="utf-8"?>
-<ds:datastoreItem xmlns:ds="http://schemas.openxmlformats.org/officeDocument/2006/customXml" ds:itemID="{10AEA2A0-C596-4161-82D6-D82504EDC790}">
+<ds:datastoreItem xmlns:ds="http://schemas.openxmlformats.org/officeDocument/2006/customXml" ds:itemID="{75D47452-D632-4C33-ACBD-A77D16E6A479}">
   <ds:schemaRefs>
-    <ds:schemaRef ds:uri="http://schemas.openxmlformats.org/officeDocument/2006/bibliography"/>
+    <ds:schemaRef ds:uri="http://schemas.microsoft.com/sharepoint/v3/contenttype/forms"/>
   </ds:schemaRefs>
 </ds:datastoreItem>
 </file>
@@ -20400,9 +22438,9 @@
 </file>
 
 <file path=customXml/itemProps4.xml><?xml version="1.0" encoding="utf-8"?>
-<ds:datastoreItem xmlns:ds="http://schemas.openxmlformats.org/officeDocument/2006/customXml" ds:itemID="{75D47452-D632-4C33-ACBD-A77D16E6A479}">
+<ds:datastoreItem xmlns:ds="http://schemas.openxmlformats.org/officeDocument/2006/customXml" ds:itemID="{10AEA2A0-C596-4161-82D6-D82504EDC790}">
   <ds:schemaRefs>
-    <ds:schemaRef ds:uri="http://schemas.microsoft.com/sharepoint/v3/contenttype/forms"/>
+    <ds:schemaRef ds:uri="http://schemas.openxmlformats.org/officeDocument/2006/bibliography"/>
   </ds:schemaRefs>
 </ds:datastoreItem>
 </file>

</xml_diff>